<commit_message>
Align research paper with course learning materials and trim to length
Revised the paper to use the course's own framework from the learning
chapters: variable classification (שמי/סודר/בדיד/רציף, Likert as ordinal
treated as continuous), validity/reliability framed as biases, reliability,
internal and external validity, sampling as random/representative/large-enough,
and Pearson correlation plus regression for the correlational/mediation design.
Added the course materials to the reference list and condensed the text to
fit the 3.5-4 page limit.

Co-Authored-By: Claude Opus 4.8 <noreply@anthropic.com>
Claude-Session: https://claude.ai/code/session_01MbejiiQPfKjUm47n1NP4CY
</commit_message>
<xml_diff>
--- a/עבודה_מחקר_כמותי_עמדות_מורים_הכלה.docx
+++ b/עבודה_מחקר_כמותי_עמדות_מורים_הכלה.docx
@@ -5,15 +5,15 @@
     <w:p>
       <w:pPr>
         <w:bidi w:val="true"/>
-        <w:spacing w:lineRule="auto" w:line="360" w:after="80" w:before="0"/>
+        <w:spacing w:lineRule="auto" w:line="360" w:after="40" w:before="0"/>
         <w:jc w:val="center"/>
       </w:pPr>
       <w:r>
         <w:rPr>
           <w:rFonts w:ascii="David" w:hAnsi="David" w:cs="David"/>
           <w:b/>
-          <w:sz w:val="32"/>
-          <w:szCs w:val="32"/>
+          <w:sz w:val="30"/>
+          <w:szCs w:val="30"/>
           <w:rtl w:val="true"/>
         </w:rPr>
         <w:t>אפיון מחקר כמותי בחינוך</w:t>
@@ -22,7 +22,7 @@
     <w:p>
       <w:pPr>
         <w:bidi w:val="true"/>
-        <w:spacing w:lineRule="auto" w:line="360" w:after="40" w:before="0"/>
+        <w:spacing w:lineRule="auto" w:line="360" w:after="20" w:before="0"/>
         <w:jc w:val="center"/>
       </w:pPr>
       <w:r>
@@ -39,7 +39,7 @@
     <w:p>
       <w:pPr>
         <w:bidi w:val="true"/>
-        <w:spacing w:lineRule="auto" w:line="360" w:after="200" w:before="0"/>
+        <w:spacing w:lineRule="auto" w:line="360" w:after="160" w:before="0"/>
         <w:jc w:val="center"/>
       </w:pPr>
       <w:r>
@@ -56,7 +56,7 @@
     <w:p>
       <w:pPr>
         <w:bidi w:val="true"/>
-        <w:spacing w:lineRule="auto" w:line="360" w:after="80" w:before="160"/>
+        <w:spacing w:lineRule="auto" w:line="360" w:after="60" w:before="140"/>
         <w:jc w:val="right"/>
       </w:pPr>
       <w:r>
@@ -73,7 +73,7 @@
     <w:p>
       <w:pPr>
         <w:bidi w:val="true"/>
-        <w:spacing w:lineRule="auto" w:line="360" w:after="120" w:before="0"/>
+        <w:spacing w:lineRule="auto" w:line="360" w:after="80" w:before="0"/>
         <w:jc w:val="both"/>
       </w:pPr>
       <w:r>
@@ -84,13 +84,13 @@
           <w:szCs w:val="24"/>
           <w:rtl w:val="true"/>
         </w:rPr>
-        <w:t>מדיניות ההכלה הפכה בעשור האחרון לברירת המחדל במערכת החינוך בישראל. חוק החינוך המיוחד ותיקוניו העבירו מספר גדל והולך של תלמידים עם צרכים מיוחדים אל הכיתה הרגילה, והמורה שעומד מול הכיתה הוא זה שאמור להפוך את המדיניות הזו למשהו שעובד בפועל, יום אחרי יום. שם, בעיניי, נמצא הלב של העניין. לא בחוק ולא בחוזר המנכ"ל, אלא באדם שצריך ללמד כיתה הטרוגנית ושונה מאוד ממה שהכיר בתחילת דרכו.</w:t>
+        <w:t>מדיניות ההכלה הפכה בעשור האחרון לברירת המחדל במערכת החינוך בישראל. חוק החינוך המיוחד ותיקוניו העבירו יותר ויותר תלמידים עם צרכים מיוחדים אל הכיתה הרגילה, והמורה שמול הכיתה הוא זה שאמור להפוך את המדיניות למשהו שעובד בפועל. שם, בעיניי, נמצא הלב של העניין. לא בחוק, אלא באדם שצריך ללמד כיתה הטרוגנית ושונה ממה שהכיר בתחילת דרכו.</w:t>
       </w:r>
     </w:p>
     <w:p>
       <w:pPr>
         <w:bidi w:val="true"/>
-        <w:spacing w:lineRule="auto" w:line="360" w:after="120" w:before="0"/>
+        <w:spacing w:lineRule="auto" w:line="360" w:after="80" w:before="0"/>
         <w:jc w:val="both"/>
       </w:pPr>
       <w:r>
@@ -101,13 +101,13 @@
           <w:szCs w:val="24"/>
           <w:rtl w:val="true"/>
         </w:rPr>
-        <w:t>הנושא שבחרתי לחקור הוא הקשר בין עמדות של מורים בחינוך הרגיל כלפי הכלה של תלמידים עם צרכים מיוחדים לבין רמת השחיקה המקצועית שלהם. לצד שני אלה אבחן משתנה שלישי, תחושת המסוגלות העצמית ההוראתית, ואברר אם הוא מתווך בין השניים. ההגדרה הממוקדת של הנושא היא אפוא בחינת הקשר שבין עמדות המורה כלפי הכלה לבין שחיקתו המקצועית, בקרב מורי כיתות רגילות המלמדים תלמידים משולבים, תוך בדיקת מקומה של תחושת המסוגלות בקשר הזה.</w:t>
+        <w:t>הנושא שבחרתי לחקור הוא הקשר בין עמדות של מורים בחינוך הרגיל כלפי הכלה של תלמידים עם צרכים מיוחדים לבין רמת השחיקה המקצועית שלהם, ומקומו של משתנה שלישי, תחושת המסוגלות העצמית ההוראתית, כמתווך בין השניים. ההגדרה הממוקדת היא אפוא בחינת הקשר עמדות-שחיקה בקרב מורי כיתות רגילות המלמדים תלמידים משולבים, ובדיקת מקומה של תחושת המסוגלות בקשר הזה.</w:t>
       </w:r>
     </w:p>
     <w:p>
       <w:pPr>
         <w:bidi w:val="true"/>
-        <w:spacing w:lineRule="auto" w:line="360" w:after="120" w:before="0"/>
+        <w:spacing w:lineRule="auto" w:line="360" w:after="80" w:before="0"/>
         <w:jc w:val="both"/>
       </w:pPr>
       <w:r>
@@ -118,30 +118,13 @@
           <w:szCs w:val="24"/>
           <w:rtl w:val="true"/>
         </w:rPr>
-        <w:t>הזיקה לחינוך ישירה. הצלחת ההכלה תלויה במידה רבה בכך שהמורים יהיו חיוביים כלפיה. מורה שרואה בשילוב נטל ולא שליחות יתקשה ליישם אותו הלכה למעשה, גם אם על הנייר הכול מסודר (Avramidis &amp; Norwich, 2002). מהצד השני עומדת השחיקה, אחת הבעיות הכואבות של המקצוע. היא קשורה לנשירת מורים, להיעדרויות ולירידה באיכות ההוראה. אם עמדות שליליות כלפי הכלה אכן מזינות שחיקה, יש לכך משמעות מעשית ברורה: אפשר להתערב, דרך הכשרה וליווי, ולא רק לקונן על המחסור במורים.</w:t>
+        <w:t>הזיקה לחינוך ישירה. הצלחת ההכלה תלויה במידה רבה בכך שהמורים יהיו חיוביים כלפיה, ומורה שרואה בשילוב נטל ולא שליחות יתקשה ליישם אותו הלכה למעשה (Avramidis &amp; Norwich, 2002). מנגד, השחיקה קשורה לנשירת מורים ולירידה באיכות ההוראה. אם עמדות שליליות מזינות שחיקה, יש לכך משמעות מעשית: אפשר להתערב דרך הכשרה וליווי, ולא רק לקונן על המחסור במורים. בחרתי בנושא מתוך עניין אישי ומתוך רצון לבדוק תופעה. לימדתי כיתה שבה שולבו תלמידים עם צרכים מיוחדים בלי הכשרה של ממש, וזכור לי היטב הפער בין הרצון לעשות טוב לבין התחושה שאני פשוט לא יודע איך.</w:t>
       </w:r>
     </w:p>
     <w:p>
       <w:pPr>
         <w:bidi w:val="true"/>
-        <w:spacing w:lineRule="auto" w:line="360" w:after="120" w:before="0"/>
-        <w:jc w:val="both"/>
-      </w:pPr>
-      <w:r>
-        <w:rPr>
-          <w:rFonts w:ascii="David" w:hAnsi="David" w:cs="David"/>
-          <w:b w:val="0"/>
-          <w:sz w:val="24"/>
-          <w:szCs w:val="24"/>
-          <w:rtl w:val="true"/>
-        </w:rPr>
-        <w:t>מדוע דווקא הנושא הזה. יש כאן עניין אישי. לימדתי כיתה שבה שולבו כמה תלמידים עם צרכים מיוחדים בלי שקיבלתי לכך הכשרה של ממש, וזכור לי היטב הפער בין הרצון לעשות טוב לבין התחושה שאני פשוט לא יודע איך. לצד זה יש כאן בדיקה של תופעה שחוזרת שוב ושוב בשיחות חדר המורים אך נבדקה פחות באופן שיטתי, בעיקר במפגש שבין העמדות לבין המחיר הרגשי. הצירוף הזה, נושא חשוב מבחינת מדיניות ושאלה שנוגעת בי אישית, הוא מה שהביא אותי לכאן.</w:t>
-      </w:r>
-    </w:p>
-    <w:p>
-      <w:pPr>
-        <w:bidi w:val="true"/>
-        <w:spacing w:lineRule="auto" w:line="360" w:after="80" w:before="160"/>
+        <w:spacing w:lineRule="auto" w:line="360" w:after="60" w:before="140"/>
         <w:jc w:val="right"/>
       </w:pPr>
       <w:r>
@@ -153,23 +136,6 @@
           <w:rtl w:val="true"/>
         </w:rPr>
         <w:t>2. שאלות המחקר</w:t>
-      </w:r>
-    </w:p>
-    <w:p>
-      <w:pPr>
-        <w:bidi w:val="true"/>
-        <w:spacing w:lineRule="auto" w:line="360" w:after="40" w:before="0"/>
-        <w:jc w:val="both"/>
-      </w:pPr>
-      <w:r>
-        <w:rPr>
-          <w:rFonts w:ascii="David" w:hAnsi="David" w:cs="David"/>
-          <w:b w:val="0"/>
-          <w:sz w:val="24"/>
-          <w:szCs w:val="24"/>
-          <w:rtl w:val="true"/>
-        </w:rPr>
-        <w:t>שתי שאלות עומדות במרכז המחקר:</w:t>
       </w:r>
     </w:p>
     <w:p>
@@ -202,7 +168,7 @@
     <w:p>
       <w:pPr>
         <w:bidi w:val="true"/>
-        <w:spacing w:lineRule="auto" w:line="360" w:after="80" w:before="0"/>
+        <w:spacing w:lineRule="auto" w:line="360" w:after="60" w:before="0"/>
         <w:jc w:val="both"/>
       </w:pPr>
       <w:r>
@@ -229,7 +195,7 @@
     <w:p>
       <w:pPr>
         <w:bidi w:val="true"/>
-        <w:spacing w:lineRule="auto" w:line="360" w:after="120" w:before="0"/>
+        <w:spacing w:lineRule="auto" w:line="360" w:after="80" w:before="0"/>
         <w:jc w:val="both"/>
       </w:pPr>
       <w:r>
@@ -240,13 +206,13 @@
           <w:szCs w:val="24"/>
           <w:rtl w:val="true"/>
         </w:rPr>
-        <w:t>בניסוח הקפדתי על כמה דברים. השאלות עוסקות בקשר בין משתנים ולא בתיאור תופעה בודדת, הן ניתנות לבדיקה אמפירית באמצעות נתונים מספריים, והן אינן קובעות מראש כיוון סיבתי חד-משמעי. הראשונה בוחנת את עצם הקשר, השנייה שואלת על המנגנון שמאחוריו, כלומר על התיווך.</w:t>
+        <w:t>בניסוח הקפדתי על העיקרון שנלמד בקורס: שאלת מחקר טובה חייבת להיות מובנת, מדויקת ומפורטת. פירוש הדבר שכל מושג בשאלה זקוק להגדרה, כדי שאני והנחקרים נדבר באותה שפה, מה נחשב 'הכלה', למי הכוונה ב'מורים', ומתי בדיוק נמדדת השחיקה. מעבר לזה, השאלות עוסקות בקשר בין משתנים ולא בתופעה בודדת, הן ניתנות לבדיקה אמפירית באמצעות נתונים מספריים, והן אינן קובעות מראש כיוון סיבתי. הראשונה בוחנת את עצם הקשר, השנייה את המנגנון שמאחוריו.</w:t>
       </w:r>
     </w:p>
     <w:p>
       <w:pPr>
         <w:bidi w:val="true"/>
-        <w:spacing w:lineRule="auto" w:line="360" w:after="80" w:before="160"/>
+        <w:spacing w:lineRule="auto" w:line="360" w:after="60" w:before="140"/>
         <w:jc w:val="right"/>
       </w:pPr>
       <w:r>
@@ -284,13 +250,13 @@
           <w:szCs w:val="24"/>
           <w:rtl w:val="true"/>
         </w:rPr>
-        <w:t>קיים קשר שלילי בין עמדות כלפי הכלה לבין שחיקה מקצועית. ככל שעמדות המורה כלפי הכלה חיוביות יותר, כך רמת שחיקתו המקצועית נמוכה יותר.</w:t>
+        <w:t>קיים קשר שלילי בין עמדות כלפי הכלה לבין שחיקה מקצועית. ככל שעמדות המורה כלפי הכלה חיוביות יותר, כך רמת שחיקתו נמוכה יותר.</w:t>
       </w:r>
     </w:p>
     <w:p>
       <w:pPr>
         <w:bidi w:val="true"/>
-        <w:spacing w:lineRule="auto" w:line="360" w:after="80" w:before="0"/>
+        <w:spacing w:lineRule="auto" w:line="360" w:after="60" w:before="0"/>
         <w:jc w:val="both"/>
       </w:pPr>
       <w:r>
@@ -311,13 +277,13 @@
           <w:szCs w:val="24"/>
           <w:rtl w:val="true"/>
         </w:rPr>
-        <w:t>תחושת המסוגלות העצמית ההוראתית מתווכת את הקשר. עמדות חיוביות יותר מנבאות תחושת מסוגלות גבוהה יותר, וזו בתורה מנבאת שחיקה נמוכה יותר.</w:t>
+        <w:t>תחושת המסוגלות העצמית מתווכת את הקשר. עמדות חיוביות יותר מנבאות מסוגלות גבוהה יותר, וזו בתורה מנבאת שחיקה נמוכה יותר.</w:t>
       </w:r>
     </w:p>
     <w:p>
       <w:pPr>
         <w:bidi w:val="true"/>
-        <w:spacing w:lineRule="auto" w:line="360" w:after="120" w:before="0"/>
+        <w:spacing w:lineRule="auto" w:line="360" w:after="80" w:before="0"/>
         <w:jc w:val="both"/>
       </w:pPr>
       <w:r>
@@ -328,13 +294,13 @@
           <w:szCs w:val="24"/>
           <w:rtl w:val="true"/>
         </w:rPr>
-        <w:t>ההשערות אינן נשלפות מהאוויר. הן נשענות על ספרות. Avramidis ו-Norwich (2002) מראים בסקירתם הרחבה שעמדות המורים כלפי שילוב אינן אחידות, ושהן מושפעות בין השאר מהכשרה, מניסיון קודם ומתחושת היכולת של המורה להתמודד עם הכיתה. משם נגזר הקשר בין עמדות למסוגלות. Tschannen-Moran ו-Woolfolk Hoy (2001) קושרים תחושת מסוגלות הוראתית גבוהה עם התמדה, מחויבות ומאמץ, כלומר עם ההפך מהתנתקות ומשחיקה. Maslach ועמיתיה (2001) מונים את המסוגלות הנמוכה כאחד הגורמים המזינים שחיקה, ובכך סוגרים את שלוש הצלעות של המודל. גם ממצאים מהשדה הישראלי תומכים בכיוון: גליקו ובראון-לבינסון (2022) מצאו שמשאבים אישיים ובית-ספריים קשורים להתמודדות אדפטיבית ולשביעות רצון של מורים המלמדים תלמידים משולבים. על בסיס אלה ניסחתי את ההשערות ככיווניות ולא רק כקיום קשר, משום שהתאוריה מכתיבה כיוון צפוי.</w:t>
+        <w:t>ההשערות נשענות על ספרות. Avramidis ו-Norwich (2002) מראים שעמדות המורים כלפי שילוב מושפעות מהכשרה, מניסיון קודם ומתחושת היכולת של המורה להתמודד עם הכיתה, ומכאן הקשר בין עמדות למסוגלות. Tschannen-Moran ו-Woolfolk Hoy (2001) קושרים מסוגלות הוראתית גבוהה עם התמדה ומחויבות, ההפך משחיקה, ו-Maslach ועמיתיה (2001) מונים מסוגלות נמוכה כאחד הגורמים המזינים שחיקה. גם בשדה הישראלי, גליקו ובראון-לבינסון (2022) מצאו שמשאבים אישיים ובית-ספריים קשורים להתמודדות אדפטיבית ולשביעות רצון של מורים המלמדים תלמידים משולבים. משום שהתאוריה מכתיבה כיוון צפוי, ניסחתי את ההשערות ככיווניות ולא רק כקיום קשר.</w:t>
       </w:r>
     </w:p>
     <w:p>
       <w:pPr>
         <w:bidi w:val="true"/>
-        <w:spacing w:lineRule="auto" w:line="360" w:after="80" w:before="160"/>
+        <w:spacing w:lineRule="auto" w:line="360" w:after="60" w:before="140"/>
         <w:jc w:val="right"/>
       </w:pPr>
       <w:r>
@@ -351,7 +317,7 @@
     <w:p>
       <w:pPr>
         <w:bidi w:val="true"/>
-        <w:spacing w:lineRule="auto" w:line="360" w:after="120" w:before="0"/>
+        <w:spacing w:lineRule="auto" w:line="360" w:after="40" w:before="0"/>
         <w:jc w:val="both"/>
       </w:pPr>
       <w:r>
@@ -372,13 +338,13 @@
           <w:szCs w:val="24"/>
           <w:rtl w:val="true"/>
         </w:rPr>
-        <w:t>שילובם של תלמידים עם צרכים מיוחדים במסגרת הכיתה הרגילה, מתוך גישה שרואה בכך זכות ולא חסד, ומתאימה את הסביבה הלימודית לתלמיד ולא להפך (Avramidis &amp; Norwich, 2002; גליקו ובראון-לבינסון, 2022).</w:t>
+        <w:t>שילובם של תלמידים עם צרכים מיוחדים במסגרת הכיתה הרגילה, מתוך גישה שרואה בכך זכות ומתאימה את הסביבה הלימודית לתלמיד ולא להפך (Avramidis &amp; Norwich, 2002).</w:t>
       </w:r>
     </w:p>
     <w:p>
       <w:pPr>
         <w:bidi w:val="true"/>
-        <w:spacing w:lineRule="auto" w:line="360" w:after="120" w:before="0"/>
+        <w:spacing w:lineRule="auto" w:line="360" w:after="40" w:before="0"/>
         <w:jc w:val="both"/>
       </w:pPr>
       <w:r>
@@ -399,13 +365,13 @@
           <w:szCs w:val="24"/>
           <w:rtl w:val="true"/>
         </w:rPr>
-        <w:t>נטייה נפשית נלמדת להעריך אובייקט מסוים, כאן ההכלה, באופן חיובי או שלילי. העמדה כוללת רכיב רגשי, רכיב קוגניטיבי ורכיב התנהגותי, והיא נמדדת כאן כמידת החיוב או השלילה שהמורה מייחס לרעיון ההכלה וליישומו (Avramidis &amp; Norwich, 2002).</w:t>
+        <w:t>נטייה נפשית נלמדת להעריך אובייקט, כאן ההכלה, באופן חיובי או שלילי. העמדה כוללת רכיב רגשי, קוגניטיבי והתנהגותי, ונמדדת כמידת החיוב שהמורה מייחס לרעיון ההכלה וליישומו (Avramidis &amp; Norwich, 2002).</w:t>
       </w:r>
     </w:p>
     <w:p>
       <w:pPr>
         <w:bidi w:val="true"/>
-        <w:spacing w:lineRule="auto" w:line="360" w:after="120" w:before="0"/>
+        <w:spacing w:lineRule="auto" w:line="360" w:after="40" w:before="0"/>
         <w:jc w:val="both"/>
       </w:pPr>
       <w:r>
@@ -416,7 +382,7 @@
           <w:szCs w:val="24"/>
           <w:rtl w:val="true"/>
         </w:rPr>
-        <w:t xml:space="preserve">תחושת מסוגלות עצמית הוראתית. </w:t>
+        <w:t xml:space="preserve">מסוגלות עצמית הוראתית. </w:t>
       </w:r>
       <w:r>
         <w:rPr>
@@ -426,13 +392,13 @@
           <w:szCs w:val="24"/>
           <w:rtl w:val="true"/>
         </w:rPr>
-        <w:t>אמונתו של המורה ביכולתו לארגן ולבצע את הפעולות הנדרשות כדי להשפיע על למידת התלמידים ועל התנהלות הכיתה, גם כשמדובר בתלמידים מאתגרים (Tschannen-Moran &amp; Woolfolk Hoy, 2001).</w:t>
+        <w:t>אמונת המורה ביכולתו לארגן ולבצע את הפעולות הנדרשות כדי להשפיע על למידת התלמידים ועל התנהלות הכיתה, גם כשמדובר בתלמידים מאתגרים (Tschannen-Moran &amp; Woolfolk Hoy, 2001).</w:t>
       </w:r>
     </w:p>
     <w:p>
       <w:pPr>
         <w:bidi w:val="true"/>
-        <w:spacing w:lineRule="auto" w:line="360" w:after="120" w:before="0"/>
+        <w:spacing w:lineRule="auto" w:line="360" w:after="40" w:before="0"/>
         <w:jc w:val="both"/>
       </w:pPr>
       <w:r>
@@ -453,13 +419,13 @@
           <w:szCs w:val="24"/>
           <w:rtl w:val="true"/>
         </w:rPr>
-        <w:t>תסמונת של מתח כרוני בעבודה, שלוש פנים לה: תשישות רגשית, דה-פרסונליזציה (התרחקות וריחוק מהתלמידים) ותחושת הישגיות אישית נמוכה (Maslach, Schaufeli &amp; Leiter, 2001).</w:t>
+        <w:t>תסמונת של מתח כרוני בעבודה, ולה שלוש פנים: תשישות רגשית, דה-פרסונליזציה (ריחוק מהתלמידים) ותחושת הישגיות אישית נמוכה (Maslach, Schaufeli &amp; Leiter, 2001).</w:t>
       </w:r>
     </w:p>
     <w:p>
       <w:pPr>
         <w:bidi w:val="true"/>
-        <w:spacing w:lineRule="auto" w:line="360" w:after="120" w:before="0"/>
+        <w:spacing w:lineRule="auto" w:line="360" w:after="80" w:before="0"/>
         <w:jc w:val="both"/>
       </w:pPr>
       <w:r>
@@ -470,13 +436,13 @@
           <w:szCs w:val="24"/>
           <w:rtl w:val="true"/>
         </w:rPr>
-        <w:t>ההגדרות הנומינליות האלה נשענות על מנועי חיפוש ומאגרים אקדמיים (Google Scholar ו-ScienceDirect), ומהן נגזרות בהמשך ההגדרות האופרציונליות, כלומר כלי המדידה של כל משתנה.</w:t>
+        <w:t>ההגדרות לעיל נשענות על חיפוש במאגרים אקדמיים (Google Scholar ו-ScienceDirect), ומהן נגזרות ההגדרות האופרציונליות, כלומר כלי המדידה של כל משתנה.</w:t>
       </w:r>
     </w:p>
     <w:p>
       <w:pPr>
         <w:bidi w:val="true"/>
-        <w:spacing w:lineRule="auto" w:line="360" w:after="80" w:before="160"/>
+        <w:spacing w:lineRule="auto" w:line="360" w:after="60" w:before="140"/>
         <w:jc w:val="right"/>
       </w:pPr>
       <w:r>
@@ -504,7 +470,24 @@
           <w:szCs w:val="24"/>
           <w:rtl w:val="true"/>
         </w:rPr>
-        <w:t>במחקר שלושה משתנים מרכזיים. המשתנה הבלתי תלוי הוא העמדות כלפי הכלה. המשתנה התלוי הוא השחיקה המקצועית. ביניהם ניצב משתנה מתווך, תחושת המסוגלות העצמית. לצדם ייאספו משתני רקע לבקרה, כמו ותק בהוראה, היקף הכשרה בחינוך מיוחד ומספר תלמידי השילוב בכיתה. הטבלה מסכמת את הסיווג ואת כלי המדידה:</w:t>
+        <w:t>במחקר שלושה משתנים מרכזיים: המשתנה הבלתי תלוי הוא העמדות כלפי הכלה, המשתנה התלוי הוא השחיקה המקצועית, וביניהם ניצב משתנה מתווך, תחושת המסוגלות העצמית. לצדם ייאספו משתני רקע לבקרה, כמו ותק בהוראה, היקף הכשרה בחינוך מיוחד ומספר תלמידי השילוב בכיתה.</w:t>
+      </w:r>
+    </w:p>
+    <w:p>
+      <w:pPr>
+        <w:bidi w:val="true"/>
+        <w:spacing w:lineRule="auto" w:line="360" w:after="60" w:before="0"/>
+        <w:jc w:val="both"/>
+      </w:pPr>
+      <w:r>
+        <w:rPr>
+          <w:rFonts w:ascii="David" w:hAnsi="David" w:cs="David"/>
+          <w:b w:val="0"/>
+          <w:sz w:val="24"/>
+          <w:szCs w:val="24"/>
+          <w:rtl w:val="true"/>
+        </w:rPr>
+        <w:t>נקודה שדורשת דיוק היא סיווג המשתנים. שלושת המשתנים המרכזיים נמדדים בשאלוני ליקרט, וברמת הפריט הבודד מדובר בסולם סודר: אפשר לדרג את התשובות, אך אי אפשר לקבוע שהמרחק בין 'מסכים' ל'מסכים מאוד' שווה למרחק בין 'מתנגד' ל'מתנגד מאוד'. עם זאת, את ציון הסולם המצרפי, שהוא ממוצע של פריטים רבים, מקובל לטפל כמשתנה כמותי רציף, וזה מה שמאפשר להריץ עליו מתאם ורגרסיה. משתני הרקע מגוונים: הוותק ומספר המשולבים כמותיים (רציף ובדיד), ואילו סוג ההכשרה והמגזר איכותיים שמיים. הטבלה מסכמת:</w:t>
       </w:r>
     </w:p>
     <w:tbl>
@@ -516,20 +499,20 @@
         <w:bidiVisual/>
       </w:tblPr>
       <w:tblGrid>
-        <w:gridCol w:w="2296"/>
-        <w:gridCol w:w="2296"/>
-        <w:gridCol w:w="2296"/>
-        <w:gridCol w:w="2296"/>
+        <w:gridCol w:w="2324"/>
+        <w:gridCol w:w="2324"/>
+        <w:gridCol w:w="2324"/>
+        <w:gridCol w:w="2324"/>
       </w:tblGrid>
       <w:tr>
         <w:tc>
           <w:tcPr>
-            <w:tcW w:type="dxa" w:w="2296"/>
+            <w:tcW w:type="dxa" w:w="2324"/>
           </w:tcPr>
           <w:p>
             <w:pPr>
               <w:bidi w:val="true"/>
-              <w:spacing w:lineRule="auto" w:line="240" w:after="40" w:before="0"/>
+              <w:spacing w:lineRule="auto" w:line="240" w:after="20" w:before="0"/>
               <w:jc w:val="right"/>
             </w:pPr>
             <w:r/>
@@ -547,12 +530,12 @@
         </w:tc>
         <w:tc>
           <w:tcPr>
-            <w:tcW w:type="dxa" w:w="2296"/>
+            <w:tcW w:type="dxa" w:w="2324"/>
           </w:tcPr>
           <w:p>
             <w:pPr>
               <w:bidi w:val="true"/>
-              <w:spacing w:lineRule="auto" w:line="240" w:after="40" w:before="0"/>
+              <w:spacing w:lineRule="auto" w:line="240" w:after="20" w:before="0"/>
               <w:jc w:val="right"/>
             </w:pPr>
             <w:r/>
@@ -570,12 +553,12 @@
         </w:tc>
         <w:tc>
           <w:tcPr>
-            <w:tcW w:type="dxa" w:w="2296"/>
+            <w:tcW w:type="dxa" w:w="2324"/>
           </w:tcPr>
           <w:p>
             <w:pPr>
               <w:bidi w:val="true"/>
-              <w:spacing w:lineRule="auto" w:line="240" w:after="40" w:before="0"/>
+              <w:spacing w:lineRule="auto" w:line="240" w:after="20" w:before="0"/>
               <w:jc w:val="right"/>
             </w:pPr>
             <w:r/>
@@ -593,12 +576,12 @@
         </w:tc>
         <w:tc>
           <w:tcPr>
-            <w:tcW w:type="dxa" w:w="2296"/>
+            <w:tcW w:type="dxa" w:w="2324"/>
           </w:tcPr>
           <w:p>
             <w:pPr>
               <w:bidi w:val="true"/>
-              <w:spacing w:lineRule="auto" w:line="240" w:after="40" w:before="0"/>
+              <w:spacing w:lineRule="auto" w:line="240" w:after="20" w:before="0"/>
               <w:jc w:val="right"/>
             </w:pPr>
             <w:r/>
@@ -618,12 +601,12 @@
       <w:tr>
         <w:tc>
           <w:tcPr>
-            <w:tcW w:type="dxa" w:w="2296"/>
+            <w:tcW w:type="dxa" w:w="2324"/>
           </w:tcPr>
           <w:p>
             <w:pPr>
               <w:bidi w:val="true"/>
-              <w:spacing w:lineRule="auto" w:line="240" w:after="40" w:before="0"/>
+              <w:spacing w:lineRule="auto" w:line="240" w:after="20" w:before="0"/>
               <w:jc w:val="right"/>
             </w:pPr>
             <w:r/>
@@ -641,12 +624,12 @@
         </w:tc>
         <w:tc>
           <w:tcPr>
-            <w:tcW w:type="dxa" w:w="2296"/>
+            <w:tcW w:type="dxa" w:w="2324"/>
           </w:tcPr>
           <w:p>
             <w:pPr>
               <w:bidi w:val="true"/>
-              <w:spacing w:lineRule="auto" w:line="240" w:after="40" w:before="0"/>
+              <w:spacing w:lineRule="auto" w:line="240" w:after="20" w:before="0"/>
               <w:jc w:val="right"/>
             </w:pPr>
             <w:r/>
@@ -664,12 +647,12 @@
         </w:tc>
         <w:tc>
           <w:tcPr>
-            <w:tcW w:type="dxa" w:w="2296"/>
+            <w:tcW w:type="dxa" w:w="2324"/>
           </w:tcPr>
           <w:p>
             <w:pPr>
               <w:bidi w:val="true"/>
-              <w:spacing w:lineRule="auto" w:line="240" w:after="40" w:before="0"/>
+              <w:spacing w:lineRule="auto" w:line="240" w:after="20" w:before="0"/>
               <w:jc w:val="right"/>
             </w:pPr>
             <w:r/>
@@ -681,18 +664,18 @@
                 <w:szCs w:val="20"/>
                 <w:rtl w:val="true"/>
               </w:rPr>
-              <w:t>כמותי רציף, סולם רווח</w:t>
+              <w:t>סולם סודר (ליקרט), הציון המצרפי מטופל כרציף</w:t>
             </w:r>
           </w:p>
         </w:tc>
         <w:tc>
           <w:tcPr>
-            <w:tcW w:type="dxa" w:w="2296"/>
+            <w:tcW w:type="dxa" w:w="2324"/>
           </w:tcPr>
           <w:p>
             <w:pPr>
               <w:bidi w:val="true"/>
-              <w:spacing w:lineRule="auto" w:line="240" w:after="40" w:before="0"/>
+              <w:spacing w:lineRule="auto" w:line="240" w:after="20" w:before="0"/>
               <w:jc w:val="right"/>
             </w:pPr>
             <w:r/>
@@ -704,7 +687,7 @@
                 <w:szCs w:val="20"/>
                 <w:rtl w:val="true"/>
               </w:rPr>
-              <w:t>שאלון עמדות מדווח-עצמי מסוג ליקרט (למשל SACIE-R), המתורגם ומותאם לעברית</w:t>
+              <w:t>שאלון עמדות מדווח-עצמי (למשל SACIE-R), מתורגם ומותאם לעברית</w:t>
             </w:r>
           </w:p>
         </w:tc>
@@ -712,12 +695,12 @@
       <w:tr>
         <w:tc>
           <w:tcPr>
-            <w:tcW w:type="dxa" w:w="2296"/>
+            <w:tcW w:type="dxa" w:w="2324"/>
           </w:tcPr>
           <w:p>
             <w:pPr>
               <w:bidi w:val="true"/>
-              <w:spacing w:lineRule="auto" w:line="240" w:after="40" w:before="0"/>
+              <w:spacing w:lineRule="auto" w:line="240" w:after="20" w:before="0"/>
               <w:jc w:val="right"/>
             </w:pPr>
             <w:r/>
@@ -735,12 +718,12 @@
         </w:tc>
         <w:tc>
           <w:tcPr>
-            <w:tcW w:type="dxa" w:w="2296"/>
+            <w:tcW w:type="dxa" w:w="2324"/>
           </w:tcPr>
           <w:p>
             <w:pPr>
               <w:bidi w:val="true"/>
-              <w:spacing w:lineRule="auto" w:line="240" w:after="40" w:before="0"/>
+              <w:spacing w:lineRule="auto" w:line="240" w:after="20" w:before="0"/>
               <w:jc w:val="right"/>
             </w:pPr>
             <w:r/>
@@ -758,12 +741,12 @@
         </w:tc>
         <w:tc>
           <w:tcPr>
-            <w:tcW w:type="dxa" w:w="2296"/>
+            <w:tcW w:type="dxa" w:w="2324"/>
           </w:tcPr>
           <w:p>
             <w:pPr>
               <w:bidi w:val="true"/>
-              <w:spacing w:lineRule="auto" w:line="240" w:after="40" w:before="0"/>
+              <w:spacing w:lineRule="auto" w:line="240" w:after="20" w:before="0"/>
               <w:jc w:val="right"/>
             </w:pPr>
             <w:r/>
@@ -775,18 +758,18 @@
                 <w:szCs w:val="20"/>
                 <w:rtl w:val="true"/>
               </w:rPr>
-              <w:t>כמותי רציף, סולם רווח</w:t>
+              <w:t>סולם סודר (ליקרט), הציון המצרפי מטופל כרציף</w:t>
             </w:r>
           </w:p>
         </w:tc>
         <w:tc>
           <w:tcPr>
-            <w:tcW w:type="dxa" w:w="2296"/>
+            <w:tcW w:type="dxa" w:w="2324"/>
           </w:tcPr>
           <w:p>
             <w:pPr>
               <w:bidi w:val="true"/>
-              <w:spacing w:lineRule="auto" w:line="240" w:after="40" w:before="0"/>
+              <w:spacing w:lineRule="auto" w:line="240" w:after="20" w:before="0"/>
               <w:jc w:val="right"/>
             </w:pPr>
             <w:r/>
@@ -798,7 +781,7 @@
                 <w:szCs w:val="20"/>
                 <w:rtl w:val="true"/>
               </w:rPr>
-              <w:t>שאלון השחיקה של מסלאך (Maslach Burnout Inventory, MBI)</w:t>
+              <w:t>שאלון השחיקה של מסלאך (Maslach Burnout Inventory)</w:t>
             </w:r>
           </w:p>
         </w:tc>
@@ -806,12 +789,12 @@
       <w:tr>
         <w:tc>
           <w:tcPr>
-            <w:tcW w:type="dxa" w:w="2296"/>
+            <w:tcW w:type="dxa" w:w="2324"/>
           </w:tcPr>
           <w:p>
             <w:pPr>
               <w:bidi w:val="true"/>
-              <w:spacing w:lineRule="auto" w:line="240" w:after="40" w:before="0"/>
+              <w:spacing w:lineRule="auto" w:line="240" w:after="20" w:before="0"/>
               <w:jc w:val="right"/>
             </w:pPr>
             <w:r/>
@@ -829,12 +812,12 @@
         </w:tc>
         <w:tc>
           <w:tcPr>
-            <w:tcW w:type="dxa" w:w="2296"/>
+            <w:tcW w:type="dxa" w:w="2324"/>
           </w:tcPr>
           <w:p>
             <w:pPr>
               <w:bidi w:val="true"/>
-              <w:spacing w:lineRule="auto" w:line="240" w:after="40" w:before="0"/>
+              <w:spacing w:lineRule="auto" w:line="240" w:after="20" w:before="0"/>
               <w:jc w:val="right"/>
             </w:pPr>
             <w:r/>
@@ -852,12 +835,12 @@
         </w:tc>
         <w:tc>
           <w:tcPr>
-            <w:tcW w:type="dxa" w:w="2296"/>
+            <w:tcW w:type="dxa" w:w="2324"/>
           </w:tcPr>
           <w:p>
             <w:pPr>
               <w:bidi w:val="true"/>
-              <w:spacing w:lineRule="auto" w:line="240" w:after="40" w:before="0"/>
+              <w:spacing w:lineRule="auto" w:line="240" w:after="20" w:before="0"/>
               <w:jc w:val="right"/>
             </w:pPr>
             <w:r/>
@@ -869,18 +852,18 @@
                 <w:szCs w:val="20"/>
                 <w:rtl w:val="true"/>
               </w:rPr>
-              <w:t>כמותי רציף, סולם רווח</w:t>
+              <w:t>סולם סודר (ליקרט), הציון המצרפי מטופל כרציף</w:t>
             </w:r>
           </w:p>
         </w:tc>
         <w:tc>
           <w:tcPr>
-            <w:tcW w:type="dxa" w:w="2296"/>
+            <w:tcW w:type="dxa" w:w="2324"/>
           </w:tcPr>
           <w:p>
             <w:pPr>
               <w:bidi w:val="true"/>
-              <w:spacing w:lineRule="auto" w:line="240" w:after="40" w:before="0"/>
+              <w:spacing w:lineRule="auto" w:line="240" w:after="20" w:before="0"/>
               <w:jc w:val="right"/>
             </w:pPr>
             <w:r/>
@@ -892,7 +875,7 @@
                 <w:szCs w:val="20"/>
                 <w:rtl w:val="true"/>
               </w:rPr>
-              <w:t>שאלון TSES של Tschannen-Moran ו-Woolfolk Hoy (2001)</w:t>
+              <w:t>שאלון TSES (Tschannen-Moran &amp; Woolfolk Hoy, 2001)</w:t>
             </w:r>
           </w:p>
         </w:tc>
@@ -900,12 +883,12 @@
       <w:tr>
         <w:tc>
           <w:tcPr>
-            <w:tcW w:type="dxa" w:w="2296"/>
+            <w:tcW w:type="dxa" w:w="2324"/>
           </w:tcPr>
           <w:p>
             <w:pPr>
               <w:bidi w:val="true"/>
-              <w:spacing w:lineRule="auto" w:line="240" w:after="40" w:before="0"/>
+              <w:spacing w:lineRule="auto" w:line="240" w:after="20" w:before="0"/>
               <w:jc w:val="right"/>
             </w:pPr>
             <w:r/>
@@ -917,18 +900,18 @@
                 <w:szCs w:val="20"/>
                 <w:rtl w:val="true"/>
               </w:rPr>
-              <w:t>ותק, הכשרה בחינוך מיוחד, מספר משולבים</w:t>
+              <w:t>ותק, הכשרה, מספר משולבים</w:t>
             </w:r>
           </w:p>
         </w:tc>
         <w:tc>
           <w:tcPr>
-            <w:tcW w:type="dxa" w:w="2296"/>
+            <w:tcW w:type="dxa" w:w="2324"/>
           </w:tcPr>
           <w:p>
             <w:pPr>
               <w:bidi w:val="true"/>
-              <w:spacing w:lineRule="auto" w:line="240" w:after="40" w:before="0"/>
+              <w:spacing w:lineRule="auto" w:line="240" w:after="20" w:before="0"/>
               <w:jc w:val="right"/>
             </w:pPr>
             <w:r/>
@@ -940,18 +923,18 @@
                 <w:szCs w:val="20"/>
                 <w:rtl w:val="true"/>
               </w:rPr>
-              <w:t>משתני רקע / בקרה</w:t>
+              <w:t>רקע / בקרה</w:t>
             </w:r>
           </w:p>
         </w:tc>
         <w:tc>
           <w:tcPr>
-            <w:tcW w:type="dxa" w:w="2296"/>
+            <w:tcW w:type="dxa" w:w="2324"/>
           </w:tcPr>
           <w:p>
             <w:pPr>
               <w:bidi w:val="true"/>
-              <w:spacing w:lineRule="auto" w:line="240" w:after="40" w:before="0"/>
+              <w:spacing w:lineRule="auto" w:line="240" w:after="20" w:before="0"/>
               <w:jc w:val="right"/>
             </w:pPr>
             <w:r/>
@@ -963,18 +946,18 @@
                 <w:szCs w:val="20"/>
                 <w:rtl w:val="true"/>
               </w:rPr>
-              <w:t>ותק ומספר משולבים: כמותי; סוג ההכשרה: איכותי קטגוריאלי</w:t>
+              <w:t>ותק ומספר משולבים: כמותי (רציף/בדיד); הכשרה ומגזר: איכותי שמי</w:t>
             </w:r>
           </w:p>
         </w:tc>
         <w:tc>
           <w:tcPr>
-            <w:tcW w:type="dxa" w:w="2296"/>
+            <w:tcW w:type="dxa" w:w="2324"/>
           </w:tcPr>
           <w:p>
             <w:pPr>
               <w:bidi w:val="true"/>
-              <w:spacing w:lineRule="auto" w:line="240" w:after="40" w:before="0"/>
+              <w:spacing w:lineRule="auto" w:line="240" w:after="20" w:before="0"/>
               <w:jc w:val="right"/>
             </w:pPr>
             <w:r/>
@@ -1011,7 +994,7 @@
     <w:p>
       <w:pPr>
         <w:bidi w:val="true"/>
-        <w:spacing w:lineRule="auto" w:line="360" w:after="120" w:before="0"/>
+        <w:spacing w:lineRule="auto" w:line="360" w:after="80" w:before="0"/>
         <w:jc w:val="both"/>
       </w:pPr>
       <w:r>
@@ -1022,13 +1005,13 @@
           <w:szCs w:val="24"/>
           <w:rtl w:val="true"/>
         </w:rPr>
-        <w:t>בחירת סוגי הכלים אינה מקרית. שלושת המשתנים המרכזיים הם תפיסות פנימיות של המורה, ולכן הכלי הטבעי למדוד אותם הוא שאלון דיווח עצמי בסולם ליקרט, שמניב ציון מספרי רציף שאפשר להריץ עליו מתאמים ורגרסיה. אילו רצינו למדוד למשל עוררות פיזיולוגית של מתח, היינו פונים לכלים אחרים כמו מדידת דופק או מוליכות עורית, אך כאן מדובר בעמדות ובאמונות, ואלה נמדדות היטב בשאלון.</w:t>
+        <w:t>בחירת הכלים אינה מקרית. שלושת המשתנים המרכזיים הם תפיסות פנימיות של המורה, ולכן הכלי הטבעי למדוד אותם הוא שאלון דיווח עצמי שמניב ציון מספרי. אילו רצינו למדוד עוררות פיזיולוגית של מתח היינו פונים לכלים כמו מדידת דופק או מוליכות עורית, אך כאן מדובר בעמדות ובאמונות, ואלה נמדדות היטב בשאלון.</w:t>
       </w:r>
     </w:p>
     <w:p>
       <w:pPr>
         <w:bidi w:val="true"/>
-        <w:spacing w:lineRule="auto" w:line="360" w:after="80" w:before="160"/>
+        <w:spacing w:lineRule="auto" w:line="360" w:after="60" w:before="140"/>
         <w:jc w:val="right"/>
       </w:pPr>
       <w:r>
@@ -1045,7 +1028,7 @@
     <w:p>
       <w:pPr>
         <w:bidi w:val="true"/>
-        <w:spacing w:lineRule="auto" w:line="360" w:after="120" w:before="0"/>
+        <w:spacing w:lineRule="auto" w:line="360" w:after="40" w:before="0"/>
         <w:jc w:val="both"/>
       </w:pPr>
       <w:r>
@@ -1056,15 +1039,25 @@
           <w:szCs w:val="24"/>
           <w:rtl w:val="true"/>
         </w:rPr>
-        <w:t>מהימנות. לכל שאלון תיבדק מהימנות עקיבות פנימית באמצעות מקדם אלפא של קרונבך, ורצוי גם מהימנות מבחן-חוזר לתת-מדגם, כדי לוודא יציבות לאורך זמן. השאלונים שנבחרו הם כלים מוכרים בעלי היסטוריית מהימנות טובה בספרות (Tschannen-Moran &amp; Woolfolk Hoy, 2001).</w:t>
+        <w:t>בקורס הובחנו כמה מושגים שצריך לתת עליהם את הדעת כאן: מהימנות, הטיות, תוקף פנימי ותוקף חיצוני.</w:t>
       </w:r>
     </w:p>
     <w:p>
       <w:pPr>
         <w:bidi w:val="true"/>
-        <w:spacing w:lineRule="auto" w:line="360" w:after="120" w:before="0"/>
+        <w:spacing w:lineRule="auto" w:line="360" w:after="40" w:before="0"/>
         <w:jc w:val="both"/>
       </w:pPr>
+      <w:r>
+        <w:rPr>
+          <w:rFonts w:ascii="David" w:hAnsi="David" w:cs="David"/>
+          <w:b/>
+          <w:sz w:val="24"/>
+          <w:szCs w:val="24"/>
+          <w:rtl w:val="true"/>
+        </w:rPr>
+        <w:t xml:space="preserve">מהימנות. </w:t>
+      </w:r>
       <w:r>
         <w:rPr>
           <w:rFonts w:ascii="David" w:hAnsi="David" w:cs="David"/>
@@ -1073,13 +1066,94 @@
           <w:szCs w:val="24"/>
           <w:rtl w:val="true"/>
         </w:rPr>
-        <w:t>תוקף. תוקף התוכן יובטח בכך שהשאלונים נגזרים מהגדרות תאורטיות מקובלות ונבדקים על ידי שופטים מומחים. תוקף המבנה ייבחן בניתוח גורמים, כדי לראות שהפריטים אכן נחלקים למדדים שהם אמורים למדוד, למשל שלושת ממדי השחיקה של מסלאך. משתנים שמתורגמים מאנגלית יעברו תרגום והתרגום-חזרה (back-translation) כדי לשמור על נאמנות למקור. נקודת תורפה שיש להכיר בה היא השונות המשותפת של השיטה (common method bias): כשכל המשתנים נמדדים באותו שאלון דיווח עצמי, חלק מהקשר עלול לנבוע מהשיטה ולא מהתוכן. בייט-מרום וצמח (2014) מדגישים את החשיבות של הבחנה זו בין תוקף למהימנות ואת התלות של איכות ההסקה בשניהם.</w:t>
+        <w:t>דיוק ועקביות של המדידה. שאלון מהימן הוא כזה שאם נעביר אותו שוב באותם תנאים נקבל בערך אותן תוצאות. אבדוק זאת במקדם אלפא של קרונבך לעקביות פנימית, ואם אפשר גם במבחן-חוזר לתת-מדגם. השאלונים שבחרתי מוכרים ובעלי מהימנות טובה בספרות (Tschannen-Moran &amp; Woolfolk Hoy, 2001).</w:t>
       </w:r>
     </w:p>
     <w:p>
       <w:pPr>
         <w:bidi w:val="true"/>
-        <w:spacing w:lineRule="auto" w:line="360" w:after="80" w:before="160"/>
+        <w:spacing w:lineRule="auto" w:line="360" w:after="40" w:before="0"/>
+        <w:jc w:val="both"/>
+      </w:pPr>
+      <w:r>
+        <w:rPr>
+          <w:rFonts w:ascii="David" w:hAnsi="David" w:cs="David"/>
+          <w:b/>
+          <w:sz w:val="24"/>
+          <w:szCs w:val="24"/>
+          <w:rtl w:val="true"/>
+        </w:rPr>
+        <w:t xml:space="preserve">הטיות. </w:t>
+      </w:r>
+      <w:r>
+        <w:rPr>
+          <w:rFonts w:ascii="David" w:hAnsi="David" w:cs="David"/>
+          <w:b w:val="0"/>
+          <w:sz w:val="24"/>
+          <w:szCs w:val="24"/>
+          <w:rtl w:val="true"/>
+        </w:rPr>
+        <w:t>גורם שמסיט את תשובת הנחקר ומרחיק אותנו מהמציאות. ההטיה המרכזית כאן היא רצייה חברתית: מורה עלול לענות מה שנראה לו 'נכון' ולא מה שהוא באמת חושב, כי הנושא רגיש. אנונימיות מלאה וניסוח זהיר של הפריטים נועדו לצמצם זאת.</w:t>
+      </w:r>
+    </w:p>
+    <w:p>
+      <w:pPr>
+        <w:bidi w:val="true"/>
+        <w:spacing w:lineRule="auto" w:line="360" w:after="40" w:before="0"/>
+        <w:jc w:val="both"/>
+      </w:pPr>
+      <w:r>
+        <w:rPr>
+          <w:rFonts w:ascii="David" w:hAnsi="David" w:cs="David"/>
+          <w:b/>
+          <w:sz w:val="24"/>
+          <w:szCs w:val="24"/>
+          <w:rtl w:val="true"/>
+        </w:rPr>
+        <w:t xml:space="preserve">תוקף פנימי. </w:t>
+      </w:r>
+      <w:r>
+        <w:rPr>
+          <w:rFonts w:ascii="David" w:hAnsi="David" w:cs="David"/>
+          <w:b w:val="0"/>
+          <w:sz w:val="24"/>
+          <w:szCs w:val="24"/>
+          <w:rtl w:val="true"/>
+        </w:rPr>
+        <w:t>השאלה אם באמת המשתנה הבלתי תלוי מסביר את מה שנצפה ולא גורם אחר. במחקר מתאמי התוקף הפנימי מוגבל מטבעו, כי איני שולט במשתנים ואיני יכול לשלול כיווני סיבתיות חלופיים, ולכן אבקר משתני רקע שעלולים להתערב.</w:t>
+      </w:r>
+    </w:p>
+    <w:p>
+      <w:pPr>
+        <w:bidi w:val="true"/>
+        <w:spacing w:lineRule="auto" w:line="360" w:after="80" w:before="0"/>
+        <w:jc w:val="both"/>
+      </w:pPr>
+      <w:r>
+        <w:rPr>
+          <w:rFonts w:ascii="David" w:hAnsi="David" w:cs="David"/>
+          <w:b/>
+          <w:sz w:val="24"/>
+          <w:szCs w:val="24"/>
+          <w:rtl w:val="true"/>
+        </w:rPr>
+        <w:t xml:space="preserve">תוקף חיצוני. </w:t>
+      </w:r>
+      <w:r>
+        <w:rPr>
+          <w:rFonts w:ascii="David" w:hAnsi="David" w:cs="David"/>
+          <w:b w:val="0"/>
+          <w:sz w:val="24"/>
+          <w:szCs w:val="24"/>
+          <w:rtl w:val="true"/>
+        </w:rPr>
+        <w:t>היכולת להכליל מהמדגם אל האוכלוסייה, התלויה בכך שהמדגם יהיה מייצג. לצד זה, תוקף התוכן של השאלונים יובטח בשיפוט מומחים ותוקף המבנה ייבחן בניתוח גורמים, ושאלונים שתורגמו מאנגלית יעברו תרגום-חזרה. נקודת תורפה היא השונות המשותפת של השיטה: כשהכול נמדד באותו שאלון דיווח עצמי, חלק מהקשר עלול לנבוע מהשיטה ולא מהתוכן (בייט-מרום וצמח, 2014).</w:t>
+      </w:r>
+    </w:p>
+    <w:p>
+      <w:pPr>
+        <w:bidi w:val="true"/>
+        <w:spacing w:lineRule="auto" w:line="360" w:after="60" w:before="140"/>
         <w:jc w:val="right"/>
       </w:pPr>
       <w:r>
@@ -1096,7 +1170,7 @@
     <w:p>
       <w:pPr>
         <w:bidi w:val="true"/>
-        <w:spacing w:lineRule="auto" w:line="360" w:after="120" w:before="0"/>
+        <w:spacing w:lineRule="auto" w:line="360" w:after="80" w:before="0"/>
         <w:jc w:val="both"/>
       </w:pPr>
       <w:r>
@@ -1107,13 +1181,13 @@
           <w:szCs w:val="24"/>
           <w:rtl w:val="true"/>
         </w:rPr>
-        <w:t>אוכלוסיית המחקר היא מורים בבתי ספר יסודיים בחינוך הרגיל בישראל, המלמדים בכיתות שבהן משולבים תלמידים עם צרכים מיוחדים. הגדרה זו ממקדת את המחקר: לא כלל המורים, אלא דווקא אלה שנפגשים בפועל עם ההכלה בכיתתם, שכן רק אצלם יש טעם לשאול על עמדות כלפי תלמידים משולבים.</w:t>
+        <w:t>אוכלוסיית המחקר היא מורים בבתי ספר יסודיים בחינוך הרגיל בישראל המלמדים בכיתות שבהן משולבים תלמידים עם צרכים מיוחדים. ההגדרה ממקדת את המחקר: לא כלל המורים, אלא דווקא אלה שנפגשים בפועל עם ההכלה בכיתתם, שכן רק אצלם יש טעם לשאול על עמדות כלפי תלמידים משולבים.</w:t>
       </w:r>
     </w:p>
     <w:p>
       <w:pPr>
         <w:bidi w:val="true"/>
-        <w:spacing w:lineRule="auto" w:line="360" w:after="120" w:before="0"/>
+        <w:spacing w:lineRule="auto" w:line="360" w:after="80" w:before="0"/>
         <w:jc w:val="both"/>
       </w:pPr>
       <w:r>
@@ -1124,13 +1198,13 @@
           <w:szCs w:val="24"/>
           <w:rtl w:val="true"/>
         </w:rPr>
-        <w:t>מכיוון שלא ניתן להגיע לכל האוכלוסייה, תיערך דגימה. אשתמש בדגימת אשכולות דו-שלבית: בשלב הראשון תיבחר מדגם של בתי ספר, מתוך ריבוד לפי מחוז ולפי מגזר, כדי לשמור על ייצוג; בשלב השני ישתתפו כלל המורים הרלוונטיים בבתי הספר שנבחרו. שיטה זו מעשית יותר מדגימה אקראית פשוטה של מורים בודדים מכל הארץ, ועדיין שומרת על אקראיות ברמת בית הספר. גודל המדגם המתוכנן הוא כ-300 מורים, מספר שמספיק לניתוח מודל תיווך ברגרסיה תוך שמירה על עוצמה סטטיסטית סבירה (בייט-מרום וצמח, 2014).</w:t>
+        <w:t>מכיוון שאי אפשר להגיע לכל האוכלוסייה, תיערך דגימה. כפי שנלמד בקורס, מדגם טוב צריך להיות מקרי, מייצג וגדול דיו, ושלוש הדרישות האלה הנחו את הבחירה. אשתמש בדגימת אשכולות דו-שלבית: תחילה ייבחר מדגם של בתי ספר מתוך ריבוד לפי מחוז ומגזר, ואז ישתתפו כלל המורים הרלוונטיים בבתי הספר שנבחרו. האקראיות ברמת בית הספר שומרת על המקריות, הריבוד דואג לייצוג, וגודל מתוכנן של כ-300 מורים נותן את ה'גדול דיו' הדרוש לניתוח מודל תיווך ברגרסיה בעוצמה סטטיסטית סבירה (בייט-מרום וצמח, 2014).</w:t>
       </w:r>
     </w:p>
     <w:p>
       <w:pPr>
         <w:bidi w:val="true"/>
-        <w:spacing w:lineRule="auto" w:line="360" w:after="80" w:before="160"/>
+        <w:spacing w:lineRule="auto" w:line="360" w:after="60" w:before="140"/>
         <w:jc w:val="right"/>
       </w:pPr>
       <w:r>
@@ -1147,7 +1221,7 @@
     <w:p>
       <w:pPr>
         <w:bidi w:val="true"/>
-        <w:spacing w:lineRule="auto" w:line="360" w:after="120" w:before="0"/>
+        <w:spacing w:lineRule="auto" w:line="360" w:after="80" w:before="0"/>
         <w:jc w:val="both"/>
       </w:pPr>
       <w:r>
@@ -1158,13 +1232,13 @@
           <w:szCs w:val="24"/>
           <w:rtl w:val="true"/>
         </w:rPr>
-        <w:t>המחקר הוא מחקר מתאמי (correlational), ולא ניסוי ולא מחקר משולב. קבעתי זאת לפי אמת מידה פשוטה: האם החוקר מתערב ומניפולציה על המשתנה הבלתי תלוי, או רק מודד אותו כפי שהוא. כאן איני מחלק מורים אקראית לקבוצות ואיני משנה במכוון את עמדותיהם. אני מודד עמדות, מסוגלות ושחיקה כפי שהן קיימות בשדה, ובוחן את הקשרים ביניהן. היעדר מניפולציה והיעדר הקצאה אקראית שוללים סיווג של המחקר כניסוי. מכיוון שכל המשתנים כמותיים ונאספים בכלי אחיד, גם אין כאן שילוב של שיטה איכותנית, ולכן אין מדובר במחקר משולב. השימוש במודל תיווך אינו הופך את המחקר לניסויי; הוא עדיין מבוסס על מתאמים, ולכן המסקנות יהיו על אודות קשרים ולא על אודות סיבתיות ודאית.</w:t>
+        <w:t>המחקר הוא מחקר מתאמי (correlational), ולא ניסוי ולא מחקר משולב. קבעתי זאת לפי אמת מידה פשוטה: האם החוקר מבצע מניפולציה על המשתנה הבלתי תלוי, או רק מודד אותו כפי שהוא. כאן איני מחלק מורים אקראית לקבוצות ואיני משנה במכוון את עמדותיהם, אלא מודד עמדות, מסוגלות ושחיקה כפי שהן בשדה ובוחן את הקשרים ביניהן. היעדר מניפולציה והקצאה אקראית שולל סיווג כניסוי, ומכיוון שכל המשתנים כמותיים ונאספים בכלי אחיד, אין כאן גם שילוב של שיטה איכותנית. מבחינת הניתוח, הקשר בין העמדות לשחיקה ייבחן במקדם המתאם של פירסון ומודל התיווך ייבדק ברגרסיה, שני כלים שנלמדו בקורס ומתאימים בדיוק למחקר מתאמי. השימוש בתיווך אינו הופך את המחקר לניסויי, ולכן המסקנות יהיו על אודות קשרים ולא על אודות סיבתיות ודאית.</w:t>
       </w:r>
     </w:p>
     <w:p>
       <w:pPr>
         <w:bidi w:val="true"/>
-        <w:spacing w:lineRule="auto" w:line="360" w:after="80" w:before="160"/>
+        <w:spacing w:lineRule="auto" w:line="360" w:after="60" w:before="140"/>
         <w:jc w:val="right"/>
       </w:pPr>
       <w:r>
@@ -1181,7 +1255,7 @@
     <w:p>
       <w:pPr>
         <w:bidi w:val="true"/>
-        <w:spacing w:lineRule="auto" w:line="360" w:after="120" w:before="0"/>
+        <w:spacing w:lineRule="auto" w:line="360" w:after="80" w:before="0"/>
         <w:jc w:val="both"/>
       </w:pPr>
       <w:r>
@@ -1192,13 +1266,13 @@
           <w:szCs w:val="24"/>
           <w:rtl w:val="true"/>
         </w:rPr>
-        <w:t>האתגר המתודולוגי המרכזי הוא שאלת הסיבתיות. גם אם יימצא קשר שלילי חזק בין עמדות חיוביות לשחיקה, לא נוכל לומר בוודאות מה גורם למה. ייתכן שעמדות חיוביות מפחיתות שחיקה, אך ייתכן גם ההפך, שמורה שחוק פשוט מפתח עמדות שליליות יותר. מבנה חתך-רוחבי אינו מכריע בשאלה הזו.</w:t>
+        <w:t>האתגר המתודולוגי המרכזי הוא הסיבתיות. גם אם יימצא קשר שלילי חזק בין עמדות חיוביות לשחיקה, מבנה חתך-רוחבי אינו מכריע מה גורם למה: ייתכן שעמדות חיוביות מפחיתות שחיקה, וייתכן שמורה שחוק מפתח עמדות שליליות יותר. לצד זה יש אתגרים מעשיים, כמו שיעור היענות נמוך של מורים עמוסים ונשירת משתתפים לאורך המחקר, ששניהם עלולים לפגוע בייצוגיות המדגם.</w:t>
       </w:r>
     </w:p>
     <w:p>
       <w:pPr>
         <w:bidi w:val="true"/>
-        <w:spacing w:lineRule="auto" w:line="360" w:after="120" w:before="0"/>
+        <w:spacing w:lineRule="auto" w:line="360" w:after="80" w:before="0"/>
         <w:jc w:val="both"/>
       </w:pPr>
       <w:r>
@@ -1209,13 +1283,13 @@
           <w:szCs w:val="24"/>
           <w:rtl w:val="true"/>
         </w:rPr>
-        <w:t>אתגר שני הוא הדיווח העצמי. שלושת המשתנים נשענים על מה שהמורה מוכן לספר על עצמו, וכאן נכנסת רצייה חברתית. הנושא רגיש: מורה עלול לחשוש שהודאה בעמדות שליליות כלפי הכלה או בתחושת שחיקה תיתפס כחוסר מקצועיות. הדבר עלול להטות את התשובות לכיוון הרצוי חברתית ולצמצם את השונות האמיתית.</w:t>
+        <w:t>מן הצד האתי הנושא מחייב זהירות. יש להבטיח הסכמה מדעת, השתתפות מרצון ואפשרות לפרוש בכל שלב. אנונימיות מלאה חשובה כאן במיוחד, גם כדי להגן על המשתתפים וגם כדי לשחרר אותם לענות בכנות בלי חשש שהמנהל או הפיקוח יזהו אותם. נדרשים אישור ועדת האתיקה של המוסד ואישור הגורמים במשרד החינוך, ושמירה על חיסיון הנתונים.</w:t>
       </w:r>
     </w:p>
     <w:p>
       <w:pPr>
         <w:bidi w:val="true"/>
-        <w:spacing w:lineRule="auto" w:line="360" w:after="120" w:before="0"/>
+        <w:spacing w:lineRule="auto" w:line="360" w:after="80" w:before="0"/>
         <w:jc w:val="both"/>
       </w:pPr>
       <w:r>
@@ -1226,13 +1300,13 @@
           <w:szCs w:val="24"/>
           <w:rtl w:val="true"/>
         </w:rPr>
-        <w:t>מן הצד האתי, הנושא מחייב זהירות. יש להבטיח הסכמה מדעת, השתתפות מרצון ואפשרות לפרוש בכל שלב. אנונימיות מלאה חשובה במיוחד כאן, גם כדי להגן על המשתתפים וגם כדי לשחרר אותם לענות בכנות, בלי חשש שהמנהל או הפיקוח יזהו אותם. נדרשים אישור ועדת האתיקה של המוסד ואישור הגורמים במשרד החינוך, ושמירה קפדנית על חיסיון הנתונים. אתגר אתי נוסף, עדין יותר, הוא הדרך שבה יוצגו הממצאים. תיאור מורים כבעלי עמדות שליליות כלפי הכלה עלול להתגלגל להאשמה של ציבור המורים, ולכן חשוב למסגר את הממצאים כתיאור של תופעה מערכתית הקוראת לתמיכה ולהכשרה, ולא כשיפוט אישי של מי שנמצא בחזית.</w:t>
+        <w:t>אתגר אתי נוסף, עדין יותר, הוא אופן הצגת הממצאים. תיאור מורים כבעלי עמדות שליליות כלפי הכלה עלול להתגלגל להאשמה של ציבור המורים, ולכן חשוב למסגר את הממצאים כתופעה מערכתית הקוראת לתמיכה ולהכשרה, ולא כשיפוט אישי של מי שנמצא בחזית.</w:t>
       </w:r>
     </w:p>
     <w:p>
       <w:pPr>
         <w:bidi w:val="true"/>
-        <w:spacing w:lineRule="auto" w:line="360" w:after="80" w:before="160"/>
+        <w:spacing w:lineRule="auto" w:line="360" w:after="60" w:before="140"/>
         <w:jc w:val="right"/>
       </w:pPr>
       <w:r>
@@ -1249,7 +1323,7 @@
     <w:p>
       <w:pPr>
         <w:bidi w:val="true"/>
-        <w:spacing w:lineRule="auto" w:line="360" w:after="80" w:before="0"/>
+        <w:spacing w:lineRule="auto" w:line="360" w:after="60" w:before="0"/>
         <w:ind w:left="454" w:hanging="454"/>
         <w:jc w:val="both"/>
       </w:pPr>
@@ -1267,7 +1341,25 @@
     <w:p>
       <w:pPr>
         <w:bidi w:val="true"/>
-        <w:spacing w:lineRule="auto" w:line="360" w:after="80" w:before="0"/>
+        <w:spacing w:lineRule="auto" w:line="360" w:after="60" w:before="0"/>
+        <w:ind w:left="454" w:hanging="454"/>
+        <w:jc w:val="both"/>
+      </w:pPr>
+      <w:r>
+        <w:rPr>
+          <w:rFonts w:ascii="David" w:hAnsi="David" w:cs="David"/>
+          <w:b w:val="0"/>
+          <w:sz w:val="24"/>
+          <w:szCs w:val="24"/>
+          <w:rtl w:val="true"/>
+        </w:rPr>
+        <w:t>דניאלס רחימי, א' (תשפ"ו). פרקי למידה בקורס "מחקר מתקדם בחינוך (שיטות מחקר כמותיות)". אור יהודה: הקריה האקדמית אונו.</w:t>
+      </w:r>
+    </w:p>
+    <w:p>
+      <w:pPr>
+        <w:bidi w:val="true"/>
+        <w:spacing w:lineRule="auto" w:line="360" w:after="60" w:before="0"/>
         <w:ind w:left="454" w:hanging="454"/>
         <w:jc w:val="both"/>
       </w:pPr>
@@ -1285,7 +1377,7 @@
     <w:p>
       <w:pPr>
         <w:bidi w:val="true"/>
-        <w:spacing w:lineRule="auto" w:line="360" w:after="80" w:before="0"/>
+        <w:spacing w:lineRule="auto" w:line="360" w:after="60" w:before="0"/>
         <w:ind w:left="454" w:hanging="454"/>
         <w:jc w:val="both"/>
       </w:pPr>
@@ -1303,7 +1395,7 @@
     <w:p>
       <w:pPr>
         <w:bidi w:val="true"/>
-        <w:spacing w:lineRule="auto" w:line="360" w:after="80" w:before="0"/>
+        <w:spacing w:lineRule="auto" w:line="360" w:after="60" w:before="0"/>
         <w:ind w:left="454" w:hanging="454"/>
         <w:jc w:val="both"/>
       </w:pPr>
@@ -1321,7 +1413,7 @@
     <w:p>
       <w:pPr>
         <w:bidi w:val="true"/>
-        <w:spacing w:lineRule="auto" w:line="360" w:after="80" w:before="0"/>
+        <w:spacing w:lineRule="auto" w:line="360" w:after="60" w:before="0"/>
         <w:ind w:left="454" w:hanging="454"/>
         <w:jc w:val="both"/>
       </w:pPr>
@@ -1338,7 +1430,7 @@
     </w:p>
     <w:sectPr>
       <w:pgSz w:w="11906" w:h="16838"/>
-      <w:pgMar w:top="1247" w:right="1361" w:bottom="1247" w:left="1361" w:header="720" w:footer="720" w:gutter="0"/>
+      <w:pgMar w:top="1134" w:right="1304" w:bottom="1134" w:left="1304" w:header="720" w:footer="720" w:gutter="0"/>
       <w:cols w:space="720"/>
       <w:docGrid w:linePitch="360"/>
       <w:bidi/>

</xml_diff>

<commit_message>
Rewrite research paper from scratch grounded in course learning chapters
Full rewrite built around the course's own logic and terminology: quantitative
research for informed decisions, population/sample (random, representative,
large enough), measurement scales (nominal/ordinal/discrete/continuous with
Likert treated as ordinal), biases and internal/external validity, and Pearson
correlation with regression for the correlational mediation design. Answers all
nine required questions in ~4 pages, David 12, 1.5 spacing, justified, RTL.

Co-Authored-By: Claude Opus 4.8 <noreply@anthropic.com>
Claude-Session: https://claude.ai/code/session_01MbejiiQPfKjUm47n1NP4CY
</commit_message>
<xml_diff>
--- a/עבודה_מחקר_כמותי_עמדות_מורים_הכלה.docx
+++ b/עבודה_מחקר_כמותי_עמדות_מורים_הכלה.docx
@@ -84,7 +84,7 @@
           <w:szCs w:val="24"/>
           <w:rtl w:val="true"/>
         </w:rPr>
-        <w:t>מדיניות ההכלה הפכה בעשור האחרון לברירת המחדל במערכת החינוך בישראל. חוק החינוך המיוחד ותיקוניו העבירו יותר ויותר תלמידים עם צרכים מיוחדים אל הכיתה הרגילה, והמורה שמול הכיתה הוא זה שאמור להפוך את המדיניות למשהו שעובד בפועל. שם, בעיניי, נמצא הלב של העניין. לא בחוק, אלא באדם שצריך ללמד כיתה הטרוגנית ושונה ממה שהכיר בתחילת דרכו.</w:t>
+        <w:t>לאורך הקורס חזר רעיון אחד כחוט השני: מחקר כמותי נועד לאפשר קבלת החלטות מושכלות המבוססות על נתונים, ולא על תחושת בטן. מהזווית הזו ניגשתי לבחירת הנושא. מדיניות ההכלה הפכה בעשור האחרון לברירת המחדל בחינוך בישראל, ותלמידים רבים עם צרכים מיוחדים לומדים היום בכיתה הרגילה. מי שנושא בפועל את המדיניות הזו הוא המורה, ולכן בחרתי להביט דווקא בו ולא בתלמיד.</w:t>
       </w:r>
     </w:p>
     <w:p>
@@ -101,7 +101,7 @@
           <w:szCs w:val="24"/>
           <w:rtl w:val="true"/>
         </w:rPr>
-        <w:t>הנושא שבחרתי לחקור הוא הקשר בין עמדות של מורים בחינוך הרגיל כלפי הכלה של תלמידים עם צרכים מיוחדים לבין רמת השחיקה המקצועית שלהם, ומקומו של משתנה שלישי, תחושת המסוגלות העצמית ההוראתית, כמתווך בין השניים. ההגדרה הממוקדת היא אפוא בחינת הקשר עמדות-שחיקה בקרב מורי כיתות רגילות המלמדים תלמידים משולבים, ובדיקת מקומה של תחושת המסוגלות בקשר הזה.</w:t>
+        <w:t>הנושא שבחרתי הוא הקשר בין עמדות של מורים בחינוך הרגיל כלפי הכלה של תלמידים עם צרכים מיוחדים לבין רמת השחיקה המקצועית שלהם, ותפקידה של תחושת המסוגלות העצמית ההוראתית כמשתנה מתווך ביניהם. בפשטות, אני שואל אם מורה שמאמין בהכלה שוחק פחות, ואם התחושה שהוא מסוגל לעמוד במשימה היא שמסבירה את הקשר.</w:t>
       </w:r>
     </w:p>
     <w:p>
@@ -118,7 +118,7 @@
           <w:szCs w:val="24"/>
           <w:rtl w:val="true"/>
         </w:rPr>
-        <w:t>הזיקה לחינוך ישירה. הצלחת ההכלה תלויה במידה רבה בכך שהמורים יהיו חיוביים כלפיה, ומורה שרואה בשילוב נטל ולא שליחות יתקשה ליישם אותו הלכה למעשה (Avramidis &amp; Norwich, 2002). מנגד, השחיקה קשורה לנשירת מורים ולירידה באיכות ההוראה. אם עמדות שליליות מזינות שחיקה, יש לכך משמעות מעשית: אפשר להתערב דרך הכשרה וליווי, ולא רק לקונן על המחסור במורים. בחרתי בנושא מתוך עניין אישי ומתוך רצון לבדוק תופעה. לימדתי כיתה שבה שולבו תלמידים עם צרכים מיוחדים בלי הכשרה של ממש, וזכור לי היטב הפער בין הרצון לעשות טוב לבין התחושה שאני פשוט לא יודע איך.</w:t>
+        <w:t>הקשר לחינוך ישיר. הצלחת ההכלה תלויה במידה רבה בעמדות המורים כלפיה, ומורה שרואה בשילוב נטל יתקשה ליישם אותו הלכה למעשה (Avramidis &amp; Norwich, 2002). מנגד, שחיקת מורים פוגעת באיכות ההוראה ומגבירה נשירה מהמקצוע. אם יתברר שעמדות שליליות קשורות לשחיקה גבוהה, זו כבר החלטה מושכלת להשקיע בהכשרה ובליווי ולא רק בגיוס מורים חדשים. בחרתי בנושא גם מסיבה אישית: לימדתי כיתה משלבת בלי הכשרה מתאימה, וחוויתי מקרוב את הפער בין הרצון לעשות טוב לבין חוסר הידיעה איך.</w:t>
       </w:r>
     </w:p>
     <w:p>
@@ -206,7 +206,7 @@
           <w:szCs w:val="24"/>
           <w:rtl w:val="true"/>
         </w:rPr>
-        <w:t>בניסוח הקפדתי על העיקרון שנלמד בקורס: שאלת מחקר טובה חייבת להיות מובנת, מדויקת ומפורטת. פירוש הדבר שכל מושג בשאלה זקוק להגדרה, כדי שאני והנחקרים נדבר באותה שפה, מה נחשב 'הכלה', למי הכוונה ב'מורים', ומתי בדיוק נמדדת השחיקה. מעבר לזה, השאלות עוסקות בקשר בין משתנים ולא בתופעה בודדת, הן ניתנות לבדיקה אמפירית באמצעות נתונים מספריים, והן אינן קובעות מראש כיוון סיבתי. הראשונה בוחנת את עצם הקשר, השנייה את המנגנון שמאחוריו.</w:t>
+        <w:t>בקורס הודגש ששאלת מחקר חייבת להיות מובנת, מדויקת ומפורטת, ושכל מושג בה זקוק להגדרה כדי שאני והנחקרים 'נדבר באותה שפה'. לכן הקפדתי להבהיר למי הכוונה ב'מורים' (מורי כיתות רגילות שיש בכיתתם תלמידים משולבים), מה נחשב 'הכלה' ומתי נמדדת השחיקה. שתי השאלות עוסקות בקשר בין משתנים ולא בתיאור תופעה בודדת, הן ניתנות לבדיקה בנתונים מספריים, והן אינן קובעות מראש כיוון סיבתי. הראשונה בודקת אם קיים קשר, השנייה שואלת מה עומד מאחוריו.</w:t>
       </w:r>
     </w:p>
     <w:p>
@@ -250,7 +250,7 @@
           <w:szCs w:val="24"/>
           <w:rtl w:val="true"/>
         </w:rPr>
-        <w:t>קיים קשר שלילי בין עמדות כלפי הכלה לבין שחיקה מקצועית. ככל שעמדות המורה כלפי הכלה חיוביות יותר, כך רמת שחיקתו נמוכה יותר.</w:t>
+        <w:t>קיים קשר שלילי בין עמדות כלפי הכלה לבין שחיקה מקצועית. ככל שעמדות המורה חיוביות יותר, כך שחיקתו נמוכה יותר.</w:t>
       </w:r>
     </w:p>
     <w:p>
@@ -294,7 +294,7 @@
           <w:szCs w:val="24"/>
           <w:rtl w:val="true"/>
         </w:rPr>
-        <w:t>ההשערות נשענות על ספרות. Avramidis ו-Norwich (2002) מראים שעמדות המורים כלפי שילוב מושפעות מהכשרה, מניסיון קודם ומתחושת היכולת של המורה להתמודד עם הכיתה, ומכאן הקשר בין עמדות למסוגלות. Tschannen-Moran ו-Woolfolk Hoy (2001) קושרים מסוגלות הוראתית גבוהה עם התמדה ומחויבות, ההפך משחיקה, ו-Maslach ועמיתיה (2001) מונים מסוגלות נמוכה כאחד הגורמים המזינים שחיקה. גם בשדה הישראלי, גליקו ובראון-לבינסון (2022) מצאו שמשאבים אישיים ובית-ספריים קשורים להתמודדות אדפטיבית ולשביעות רצון של מורים המלמדים תלמידים משולבים. משום שהתאוריה מכתיבה כיוון צפוי, ניסחתי את ההשערות ככיווניות ולא רק כקיום קשר.</w:t>
+        <w:t>ניסחתי את ההשערות בכיוון מוגדר ולא כקיום קשר בלבד, משום שהספרות מצביעה על כיוון צפוי. Avramidis ו-Norwich (2002) מראים שעמדות המורים כלפי שילוב מושפעות מהכשרה, מניסיון קודם ומתחושת היכולת של המורה, וכך נקשרות העמדות למסוגלות. Tschannen-Moran ו-Woolfolk Hoy (2001) מוצאים שמסוגלות הוראתית גבוהה הולכת יחד עם התמדה ומחויבות, שהם ההפך משחיקה. Maslach ועמיתיה (2001) מונים מסוגלות נמוכה בין הגורמים המזינים שחיקה, ובכך נסגר המשולש. גם בשדה הישראלי, גליקו ובראון-לבינסון (2022) מצאו שמשאבים אישיים ובית-ספריים קשורים להתמודדות אדפטיבית ולשביעות רצון בקרב מורים המלמדים תלמידים משולבים.</w:t>
       </w:r>
     </w:p>
     <w:p>
@@ -338,7 +338,7 @@
           <w:szCs w:val="24"/>
           <w:rtl w:val="true"/>
         </w:rPr>
-        <w:t>שילובם של תלמידים עם צרכים מיוחדים במסגרת הכיתה הרגילה, מתוך גישה שרואה בכך זכות ומתאימה את הסביבה הלימודית לתלמיד ולא להפך (Avramidis &amp; Norwich, 2002).</w:t>
+        <w:t>שילובם של תלמידים עם צרכים מיוחדים בכיתה הרגילה, מתוך גישה שרואה בכך זכות ומתאימה את הסביבה הלימודית לתלמיד ולא להפך (Avramidis &amp; Norwich, 2002).</w:t>
       </w:r>
     </w:p>
     <w:p>
@@ -392,7 +392,7 @@
           <w:szCs w:val="24"/>
           <w:rtl w:val="true"/>
         </w:rPr>
-        <w:t>אמונת המורה ביכולתו לארגן ולבצע את הפעולות הנדרשות כדי להשפיע על למידת התלמידים ועל התנהלות הכיתה, גם כשמדובר בתלמידים מאתגרים (Tschannen-Moran &amp; Woolfolk Hoy, 2001).</w:t>
+        <w:t>אמונת המורה ביכולתו לארגן ולבצע את הפעולות הנדרשות כדי להשפיע על למידת התלמידים ועל התנהלות הכיתה, גם מול תלמידים מאתגרים (Tschannen-Moran &amp; Woolfolk Hoy, 2001).</w:t>
       </w:r>
     </w:p>
     <w:p>
@@ -419,7 +419,7 @@
           <w:szCs w:val="24"/>
           <w:rtl w:val="true"/>
         </w:rPr>
-        <w:t>תסמונת של מתח כרוני בעבודה, ולה שלוש פנים: תשישות רגשית, דה-פרסונליזציה (ריחוק מהתלמידים) ותחושת הישגיות אישית נמוכה (Maslach, Schaufeli &amp; Leiter, 2001).</w:t>
+        <w:t>תסמונת של מתח כרוני בעבודה, ולה שלושה ממדים: תשישות רגשית, דה-פרסונליזציה (ריחוק מהתלמידים) ותחושת הישגיות אישית נמוכה (Maslach, Schaufeli &amp; Leiter, 2001).</w:t>
       </w:r>
     </w:p>
     <w:p>
@@ -436,7 +436,7 @@
           <w:szCs w:val="24"/>
           <w:rtl w:val="true"/>
         </w:rPr>
-        <w:t>ההגדרות לעיל נשענות על חיפוש במאגרים אקדמיים (Google Scholar ו-ScienceDirect), ומהן נגזרות ההגדרות האופרציונליות, כלומר כלי המדידה של כל משתנה.</w:t>
+        <w:t>את ההגדרות בדקתי במאגרים אקדמיים (Google Scholar ו-ScienceDirect). מהן נגזרות ההגדרות האופרציונליות, כלומר כלי המדידה של כל משתנה, כפי שיפורט בסעיף הבא.</w:t>
       </w:r>
     </w:p>
     <w:p>
@@ -470,7 +470,7 @@
           <w:szCs w:val="24"/>
           <w:rtl w:val="true"/>
         </w:rPr>
-        <w:t>במחקר שלושה משתנים מרכזיים: המשתנה הבלתי תלוי הוא העמדות כלפי הכלה, המשתנה התלוי הוא השחיקה המקצועית, וביניהם ניצב משתנה מתווך, תחושת המסוגלות העצמית. לצדם ייאספו משתני רקע לבקרה, כמו ותק בהוראה, היקף הכשרה בחינוך מיוחד ומספר תלמידי השילוב בכיתה.</w:t>
+        <w:t>במחקר שלושה משתנים מרכזיים. המשתנה הבלתי תלוי הוא העמדות כלפי הכלה, המשתנה התלוי הוא השחיקה המקצועית, וביניהם ניצב המשתנה המתווך, תחושת המסוגלות העצמית. לצדם ייאספו משתני רקע לבקרה: ותק בהוראה, היקף הכשרה בחינוך מיוחד ומספר תלמידי השילוב בכיתה.</w:t>
       </w:r>
     </w:p>
     <w:p>
@@ -487,7 +487,7 @@
           <w:szCs w:val="24"/>
           <w:rtl w:val="true"/>
         </w:rPr>
-        <w:t>נקודה שדורשת דיוק היא סיווג המשתנים. שלושת המשתנים המרכזיים נמדדים בשאלוני ליקרט, וברמת הפריט הבודד מדובר בסולם סודר: אפשר לדרג את התשובות, אך אי אפשר לקבוע שהמרחק בין 'מסכים' ל'מסכים מאוד' שווה למרחק בין 'מתנגד' ל'מתנגד מאוד'. עם זאת, את ציון הסולם המצרפי, שהוא ממוצע של פריטים רבים, מקובל לטפל כמשתנה כמותי רציף, וזה מה שמאפשר להריץ עליו מתאם ורגרסיה. משתני הרקע מגוונים: הוותק ומספר המשולבים כמותיים (רציף ובדיד), ואילו סוג ההכשרה והמגזר איכותיים שמיים. הטבלה מסכמת:</w:t>
+        <w:t>סיווג המשתנים דורש דיוק, משום שכפי שנלמד בקורס לסוג הסולם יש משמעות ליכולת לנתח את הנתונים. שלושת המשתנים המרכזיים נמדדים בשאלוני ליקרט, וברמת הפריט הבודד מדובר בסולם סודר: אפשר לדרג את התשובות מהסכמה מלאה ועד אי-הסכמה, אך אי אפשר לקבוע שהמרחק בין 'מסכים' ל'מסכים מאוד' שווה למרחק בין 'מתנגד' ל'מתנגד מאוד'. עם זאת, את ציון הסולם המצרפי, שהוא ממוצע של פריטים רבים, מקובל לטפל כמשתנה כמותי רציף, וזה מה שמאפשר להריץ עליו מקדם מתאם ורגרסיה. משתני הרקע מגוונים: הוותק ומספר המשולבים כמותיים (רציף ובדיד), ואילו סוג ההכשרה והמגזר איכותיים שמיים. הטבלה מסכמת:</w:t>
       </w:r>
     </w:p>
     <w:tbl>
@@ -1005,7 +1005,7 @@
           <w:szCs w:val="24"/>
           <w:rtl w:val="true"/>
         </w:rPr>
-        <w:t>בחירת הכלים אינה מקרית. שלושת המשתנים המרכזיים הם תפיסות פנימיות של המורה, ולכן הכלי הטבעי למדוד אותם הוא שאלון דיווח עצמי שמניב ציון מספרי. אילו רצינו למדוד עוררות פיזיולוגית של מתח היינו פונים לכלים כמו מדידת דופק או מוליכות עורית, אך כאן מדובר בעמדות ובאמונות, ואלה נמדדות היטב בשאלון.</w:t>
+        <w:t>הבחירה בשאלונים אינה מקרית. שלושת המשתנים המרכזיים הם תפיסות פנימיות של המורה, ולכן הכלי הטבעי למדוד אותם הוא שאלון דיווח עצמי שמניב ציון מספרי. אילו רצינו למדוד עוררות פיזיולוגית של מתח היינו פונים למדידת דופק או מוליכות עורית, אך כאן מדובר בעמדות ובאמונות, ואלה נמדדות היטב בשאלון.</w:t>
       </w:r>
     </w:p>
     <w:p>
@@ -1039,7 +1039,7 @@
           <w:szCs w:val="24"/>
           <w:rtl w:val="true"/>
         </w:rPr>
-        <w:t>בקורס הובחנו כמה מושגים שצריך לתת עליהם את הדעת כאן: מהימנות, הטיות, תוקף פנימי ותוקף חיצוני.</w:t>
+        <w:t>בקורס נלמדו כמה מושגים שיש לתת עליהם את הדעת כאן: מהימנות, הטיות, תוקף פנימי ותוקף חיצוני.</w:t>
       </w:r>
     </w:p>
     <w:p>
@@ -1066,7 +1066,7 @@
           <w:szCs w:val="24"/>
           <w:rtl w:val="true"/>
         </w:rPr>
-        <w:t>דיוק ועקביות של המדידה. שאלון מהימן הוא כזה שאם נעביר אותו שוב באותם תנאים נקבל בערך אותן תוצאות. אבדוק זאת במקדם אלפא של קרונבך לעקביות פנימית, ואם אפשר גם במבחן-חוזר לתת-מדגם. השאלונים שבחרתי מוכרים ובעלי מהימנות טובה בספרות (Tschannen-Moran &amp; Woolfolk Hoy, 2001).</w:t>
+        <w:t>דיוק ועקביות של המדידה. שאלון מהימן הוא כזה שאם נעביר אותו שוב באותם תנאים נקבל בערך אותן תוצאות, בדיוק כמו מאזניים שאמורים להראות אותו משקל בשתי שקילות סמוכות. אבדוק זאת במקדם אלפא של קרונבך, ואם אפשר גם במבחן-חוזר לתת-מדגם.</w:t>
       </w:r>
     </w:p>
     <w:p>
@@ -1147,7 +1147,7 @@
           <w:szCs w:val="24"/>
           <w:rtl w:val="true"/>
         </w:rPr>
-        <w:t>היכולת להכליל מהמדגם אל האוכלוסייה, התלויה בכך שהמדגם יהיה מייצג. לצד זה, תוקף התוכן של השאלונים יובטח בשיפוט מומחים ותוקף המבנה ייבחן בניתוח גורמים, ושאלונים שתורגמו מאנגלית יעברו תרגום-חזרה. נקודת תורפה היא השונות המשותפת של השיטה: כשהכול נמדד באותו שאלון דיווח עצמי, חלק מהקשר עלול לנבוע מהשיטה ולא מהתוכן (בייט-מרום וצמח, 2014).</w:t>
+        <w:t>היכולת להכליל מהמדגם אל האוכלוסייה, התלויה בכך שהמדגם יהיה מייצג. לצד זה, תוקף התוכן יובטח בשיפוט מומחים ותוקף המבנה ייבחן בניתוח גורמים, ושאלונים שתורגמו מאנגלית יעברו תרגום-חזרה. בייט-מרום וצמח (2014) מדגישים את ההבחנה בין תוקף למהימנות ואת התלות של איכות ההסקה בשניהם.</w:t>
       </w:r>
     </w:p>
     <w:p>
@@ -1181,7 +1181,7 @@
           <w:szCs w:val="24"/>
           <w:rtl w:val="true"/>
         </w:rPr>
-        <w:t>אוכלוסיית המחקר היא מורים בבתי ספר יסודיים בחינוך הרגיל בישראל המלמדים בכיתות שבהן משולבים תלמידים עם צרכים מיוחדים. ההגדרה ממקדת את המחקר: לא כלל המורים, אלא דווקא אלה שנפגשים בפועל עם ההכלה בכיתתם, שכן רק אצלם יש טעם לשאול על עמדות כלפי תלמידים משולבים.</w:t>
+        <w:t>אוכלוסיית המחקר היא מורים בבתי ספר יסודיים בחינוך הרגיל בישראל המלמדים בכיתות שיש בהן תלמידים משולבים. ההגדרה ממקדת את המחקר: לא כלל המורים, אלא דווקא אלה שנפגשים בפועל עם ההכלה, שכן רק אצלם יש טעם לשאול על עמדות כלפי תלמידים משולבים. כל מורה כזה הוא פריט באוכלוסייה, והתכונות שנאסוף עליו הן העמדות, המסוגלות, השחיקה ומשתני הרקע.</w:t>
       </w:r>
     </w:p>
     <w:p>
@@ -1198,7 +1198,7 @@
           <w:szCs w:val="24"/>
           <w:rtl w:val="true"/>
         </w:rPr>
-        <w:t>מכיוון שאי אפשר להגיע לכל האוכלוסייה, תיערך דגימה. כפי שנלמד בקורס, מדגם טוב צריך להיות מקרי, מייצג וגדול דיו, ושלוש הדרישות האלה הנחו את הבחירה. אשתמש בדגימת אשכולות דו-שלבית: תחילה ייבחר מדגם של בתי ספר מתוך ריבוד לפי מחוז ומגזר, ואז ישתתפו כלל המורים הרלוונטיים בבתי הספר שנבחרו. האקראיות ברמת בית הספר שומרת על המקריות, הריבוד דואג לייצוג, וגודל מתוכנן של כ-300 מורים נותן את ה'גדול דיו' הדרוש לניתוח מודל תיווך ברגרסיה בעוצמה סטטיסטית סבירה (בייט-מרום וצמח, 2014).</w:t>
+        <w:t>מכיוון שאי אפשר לפנות לכל האוכלוסייה, נסתמך על מדגם. כפי שנלמד, מדגם טוב חייב להיות מקרי, מייצג וגדול דיו, ושלוש הדרישות האלה הנחו אותי. אשתמש בדגימת אשכולות דו-שלבית: תחילה ייבחר מדגם של בתי ספר מתוך ריבוד לפי מחוז ומגזר, ואז ישתתפו כלל המורים הרלוונטיים בבתי הספר שנבחרו. האקראיות ברמת בית הספר שומרת על המקריות, הריבוד דואג לייצוג, וגודל מתוכנן של כ-300 מורים נותן את ה'גדול דיו' הדרוש לניתוח מודל תיווך בעוצמה סטטיסטית סבירה (בייט-מרום וצמח, 2014).</w:t>
       </w:r>
     </w:p>
     <w:p>
@@ -1232,7 +1232,7 @@
           <w:szCs w:val="24"/>
           <w:rtl w:val="true"/>
         </w:rPr>
-        <w:t>המחקר הוא מחקר מתאמי (correlational), ולא ניסוי ולא מחקר משולב. קבעתי זאת לפי אמת מידה פשוטה: האם החוקר מבצע מניפולציה על המשתנה הבלתי תלוי, או רק מודד אותו כפי שהוא. כאן איני מחלק מורים אקראית לקבוצות ואיני משנה במכוון את עמדותיהם, אלא מודד עמדות, מסוגלות ושחיקה כפי שהן בשדה ובוחן את הקשרים ביניהן. היעדר מניפולציה והקצאה אקראית שולל סיווג כניסוי, ומכיוון שכל המשתנים כמותיים ונאספים בכלי אחיד, אין כאן גם שילוב של שיטה איכותנית. מבחינת הניתוח, הקשר בין העמדות לשחיקה ייבחן במקדם המתאם של פירסון ומודל התיווך ייבדק ברגרסיה, שני כלים שנלמדו בקורס ומתאימים בדיוק למחקר מתאמי. השימוש בתיווך אינו הופך את המחקר לניסויי, ולכן המסקנות יהיו על אודות קשרים ולא על אודות סיבתיות ודאית.</w:t>
+        <w:t>המחקר הוא מחקר מתאמי (correlational), ולא ניסוי ולא מחקר משולב. אמת המידה שהובילה אותי פשוטה: האם החוקר מבצע מניפולציה על המשתנה הבלתי תלוי או רק מודד אותו כפי שהוא. כאן איני מחלק מורים אקראית לקבוצות ואיני משנה במכוון את עמדותיהם, אלא מודד עמדות, מסוגלות ושחיקה כפי שהן בשדה ובוחן את הקשרים ביניהן. היעדר מניפולציה והקצאה אקראית שולל סיווג כניסוי, ומכיוון שכל המשתנים כמותיים ונאספים בכלי אחיד, אין כאן גם שילוב של שיטה איכותנית. מבחינת הניתוח, הקשר בין העמדות לשחיקה ייבחן באמצעות מקדם המתאם של פירסון, ומודל התיווך ייבדק ברגרסיה, שני כלים שנלמדו בקורס ומתאימים בדיוק למחקר מתאמי המבקש לאמוד עוצמה וכיוון של קשר. מכאן שהמסקנות יעסקו בקשרים ולא בסיבתיות ודאית.</w:t>
       </w:r>
     </w:p>
     <w:p>
@@ -1300,7 +1300,7 @@
           <w:szCs w:val="24"/>
           <w:rtl w:val="true"/>
         </w:rPr>
-        <w:t>אתגר אתי נוסף, עדין יותר, הוא אופן הצגת הממצאים. תיאור מורים כבעלי עמדות שליליות כלפי הכלה עלול להתגלגל להאשמה של ציבור המורים, ולכן חשוב למסגר את הממצאים כתופעה מערכתית הקוראת לתמיכה ולהכשרה, ולא כשיפוט אישי של מי שנמצא בחזית.</w:t>
+        <w:t>אתגר אתי אחרון, עדין יותר, הוא אופן הצגת הממצאים. תיאור מורים כבעלי עמדות שליליות כלפי הכלה עלול להתגלגל להאשמה של ציבור המורים, ולכן חשוב למסגר את הממצאים כתופעה מערכתית הקוראת לתמיכה ולהכשרה, ולא כשיפוט אישי של מי שעומד בחזית.</w:t>
       </w:r>
     </w:p>
     <w:p>

</xml_diff>

<commit_message>
Add descriptive-statistics step tying analysis to course chapters 5 and 7
Extends the analysis section to open with descriptive statistics: central
tendency (mean, median, mode), dispersion (standard deviation, interquartile
range), and graphical presentation (frequency tables, histogram) before moving
to Pearson correlation and regression.

Co-Authored-By: Claude Opus 4.8 <noreply@anthropic.com>
Claude-Session: https://claude.ai/code/session_01MbejiiQPfKjUm47n1NP4CY
</commit_message>
<xml_diff>
--- a/עבודה_מחקר_כמותי_עמדות_מורים_הכלה.docx
+++ b/עבודה_מחקר_כמותי_עמדות_מורים_הכלה.docx
@@ -1232,7 +1232,24 @@
           <w:szCs w:val="24"/>
           <w:rtl w:val="true"/>
         </w:rPr>
-        <w:t>המחקר הוא מחקר מתאמי (correlational), ולא ניסוי ולא מחקר משולב. אמת המידה שהובילה אותי פשוטה: האם החוקר מבצע מניפולציה על המשתנה הבלתי תלוי או רק מודד אותו כפי שהוא. כאן איני מחלק מורים אקראית לקבוצות ואיני משנה במכוון את עמדותיהם, אלא מודד עמדות, מסוגלות ושחיקה כפי שהן בשדה ובוחן את הקשרים ביניהן. היעדר מניפולציה והקצאה אקראית שולל סיווג כניסוי, ומכיוון שכל המשתנים כמותיים ונאספים בכלי אחיד, אין כאן גם שילוב של שיטה איכותנית. מבחינת הניתוח, הקשר בין העמדות לשחיקה ייבחן באמצעות מקדם המתאם של פירסון, ומודל התיווך ייבדק ברגרסיה, שני כלים שנלמדו בקורס ומתאימים בדיוק למחקר מתאמי המבקש לאמוד עוצמה וכיוון של קשר. מכאן שהמסקנות יעסקו בקשרים ולא בסיבתיות ודאית.</w:t>
+        <w:t>המחקר הוא מחקר מתאמי (correlational), ולא ניסוי ולא מחקר משולב. אמת המידה שהובילה אותי פשוטה: האם החוקר מבצע מניפולציה על המשתנה הבלתי תלוי או רק מודד אותו כפי שהוא. כאן איני מחלק מורים אקראית לקבוצות ואיני משנה במכוון את עמדותיהם, אלא מודד עמדות, מסוגלות ושחיקה כפי שהן בשדה ובוחן את הקשרים ביניהן. היעדר מניפולציה והקצאה אקראית שולל סיווג כניסוי, ומכיוון שכל המשתנים כמותיים ונאספים בכלי אחיד, אין כאן גם שילוב של שיטה איכותנית.</w:t>
+      </w:r>
+    </w:p>
+    <w:p>
+      <w:pPr>
+        <w:bidi w:val="true"/>
+        <w:spacing w:lineRule="auto" w:line="360" w:after="80" w:before="0"/>
+        <w:jc w:val="both"/>
+      </w:pPr>
+      <w:r>
+        <w:rPr>
+          <w:rFonts w:ascii="David" w:hAnsi="David" w:cs="David"/>
+          <w:b w:val="0"/>
+          <w:sz w:val="24"/>
+          <w:szCs w:val="24"/>
+          <w:rtl w:val="true"/>
+        </w:rPr>
+        <w:t>מבחינת הניתוח, אתחיל בסטטיסטיקה תיאורית: מדדי מרכז (ממוצע, חציון ושכיח) ומדדי פיזור (סטיית תקן ותחום בין-רבעוני) לכל משתנה, לצד הצגה בטבלאות שכיחות ובהיסטוגרמה, כדי לקבל תמונה מסודרת של הנתונים לפני ההסקה. רק אז אעבור לבחון את הקשר בין העמדות לשחיקה באמצעות מקדם המתאם של פירסון ואת מודל התיווך ברגרסיה, כלים שמתאימים בדיוק למחקר מתאמי המבקש לאמוד עוצמה וכיוון של קשר. מכאן שהמסקנות יעסקו בקשרים ולא בסיבתיות ודאית.</w:t>
       </w:r>
     </w:p>
     <w:p>

</xml_diff>

<commit_message>
Add title page with Ono logo and submitter to the inclusion paper
Adds a cover page (Ono logo, faculty/degree lines, title, course, semester,
submitter Yasmin Taha with ID, lecturer) and a page break before the body.
Body formatting unchanged (David 12, 1.5 spacing, justified, RTL).

Co-Authored-By: Claude Opus 4.8 <noreply@anthropic.com>
Claude-Session: https://claude.ai/code/session_01MbejiiQPfKjUm47n1NP4CY
</commit_message>
<xml_diff>
--- a/עבודה_מחקר_כמותי_עמדות_מורים_הכלה.docx
+++ b/עבודה_מחקר_כמותי_עמדות_מורים_הכלה.docx
@@ -2,6 +2,226 @@
 <file path=word/document.xml><?xml version="1.0" encoding="utf-8"?>
 <w:document xmlns:wpc="http://schemas.microsoft.com/office/word/2010/wordprocessingCanvas" xmlns:mo="http://schemas.microsoft.com/office/mac/office/2008/main" xmlns:mc="http://schemas.openxmlformats.org/markup-compatibility/2006" xmlns:mv="urn:schemas-microsoft-com:mac:vml" xmlns:o="urn:schemas-microsoft-com:office:office" xmlns:r="http://schemas.openxmlformats.org/officeDocument/2006/relationships" xmlns:m="http://schemas.openxmlformats.org/officeDocument/2006/math" xmlns:v="urn:schemas-microsoft-com:vml" xmlns:wp14="http://schemas.microsoft.com/office/word/2010/wordprocessingDrawing" xmlns:wp="http://schemas.openxmlformats.org/drawingml/2006/wordprocessingDrawing" xmlns:w10="urn:schemas-microsoft-com:office:word" xmlns:w="http://schemas.openxmlformats.org/wordprocessingml/2006/main" xmlns:w14="http://schemas.microsoft.com/office/word/2010/wordml" xmlns:wpg="http://schemas.microsoft.com/office/word/2010/wordprocessingGroup" xmlns:wpi="http://schemas.microsoft.com/office/word/2010/wordprocessingInk" xmlns:wne="http://schemas.microsoft.com/office/word/2006/wordml" xmlns:wps="http://schemas.microsoft.com/office/word/2010/wordprocessingShape" mc:Ignorable="w14 wp14">
   <w:body>
+    <w:p>
+      <w:pPr>
+        <w:bidi w:val="true"/>
+        <w:spacing w:lineRule="auto" w:line="360" w:after="120" w:before="0"/>
+        <w:jc w:val="center"/>
+      </w:pPr>
+      <w:r>
+        <w:rPr>
+          <w:rFonts w:ascii="David" w:hAnsi="David" w:cs="David"/>
+          <w:b w:val="0"/>
+          <w:sz w:val="24"/>
+          <w:szCs w:val="24"/>
+          <w:rtl w:val="true"/>
+        </w:rPr>
+      </w:r>
+    </w:p>
+    <w:p>
+      <w:pPr>
+        <w:bidi w:val="true"/>
+        <w:spacing w:lineRule="auto" w:line="360" w:after="280" w:before="0"/>
+        <w:jc w:val="center"/>
+      </w:pPr>
+      <w:r>
+        <w:drawing>
+          <wp:inline xmlns:a="http://schemas.openxmlformats.org/drawingml/2006/main" xmlns:pic="http://schemas.openxmlformats.org/drawingml/2006/picture">
+            <wp:extent cx="1872000" cy="1872000"/>
+            <wp:docPr id="1" name="Picture 1"/>
+            <wp:cNvGraphicFramePr>
+              <a:graphicFrameLocks noChangeAspect="1"/>
+            </wp:cNvGraphicFramePr>
+            <a:graphic>
+              <a:graphicData uri="http://schemas.openxmlformats.org/drawingml/2006/picture">
+                <pic:pic>
+                  <pic:nvPicPr>
+                    <pic:cNvPr id="0" name="66411cfa-IMG_3708.jpeg"/>
+                    <pic:cNvPicPr/>
+                  </pic:nvPicPr>
+                  <pic:blipFill>
+                    <a:blip r:embed="rId9"/>
+                    <a:stretch>
+                      <a:fillRect/>
+                    </a:stretch>
+                  </pic:blipFill>
+                  <pic:spPr>
+                    <a:xfrm>
+                      <a:off x="0" y="0"/>
+                      <a:ext cx="1872000" cy="1872000"/>
+                    </a:xfrm>
+                    <a:prstGeom prst="rect"/>
+                  </pic:spPr>
+                </pic:pic>
+              </a:graphicData>
+            </a:graphic>
+          </wp:inline>
+        </w:drawing>
+      </w:r>
+    </w:p>
+    <w:p>
+      <w:pPr>
+        <w:bidi w:val="true"/>
+        <w:spacing w:lineRule="auto" w:line="360" w:after="60" w:before="0"/>
+        <w:jc w:val="center"/>
+      </w:pPr>
+      <w:r>
+        <w:rPr>
+          <w:rFonts w:ascii="David" w:hAnsi="David" w:cs="David"/>
+          <w:b/>
+          <w:sz w:val="30"/>
+          <w:szCs w:val="30"/>
+          <w:rtl w:val="true"/>
+        </w:rPr>
+        <w:t>הקריה האקדמית אונו</w:t>
+      </w:r>
+    </w:p>
+    <w:p>
+      <w:pPr>
+        <w:bidi w:val="true"/>
+        <w:spacing w:lineRule="auto" w:line="360" w:after="40" w:before="0"/>
+        <w:jc w:val="center"/>
+      </w:pPr>
+      <w:r>
+        <w:rPr>
+          <w:rFonts w:ascii="David" w:hAnsi="David" w:cs="David"/>
+          <w:b/>
+          <w:sz w:val="26"/>
+          <w:szCs w:val="26"/>
+          <w:rtl w:val="true"/>
+        </w:rPr>
+        <w:t>הפקולטה למדעי הרוח והחברה</w:t>
+      </w:r>
+    </w:p>
+    <w:p>
+      <w:pPr>
+        <w:bidi w:val="true"/>
+        <w:spacing w:lineRule="auto" w:line="360" w:after="800" w:before="0"/>
+        <w:jc w:val="center"/>
+      </w:pPr>
+      <w:r>
+        <w:rPr>
+          <w:rFonts w:ascii="David" w:hAnsi="David" w:cs="David"/>
+          <w:b w:val="0"/>
+          <w:sz w:val="24"/>
+          <w:szCs w:val="24"/>
+          <w:rtl w:val="true"/>
+        </w:rPr>
+        <w:t>לימודים לתואר מוסמך</w:t>
+      </w:r>
+    </w:p>
+    <w:p>
+      <w:pPr>
+        <w:bidi w:val="true"/>
+        <w:spacing w:lineRule="auto" w:line="360" w:after="120" w:before="0"/>
+        <w:jc w:val="center"/>
+      </w:pPr>
+      <w:r>
+        <w:rPr>
+          <w:rFonts w:ascii="David" w:hAnsi="David" w:cs="David"/>
+          <w:b/>
+          <w:sz w:val="36"/>
+          <w:szCs w:val="36"/>
+          <w:rtl w:val="true"/>
+        </w:rPr>
+        <w:t>אפיון מחקר כמותי בחינוך</w:t>
+      </w:r>
+    </w:p>
+    <w:p>
+      <w:pPr>
+        <w:bidi w:val="true"/>
+        <w:spacing w:lineRule="auto" w:line="360" w:after="880" w:before="0"/>
+        <w:jc w:val="center"/>
+      </w:pPr>
+      <w:r>
+        <w:rPr>
+          <w:rFonts w:ascii="David" w:hAnsi="David" w:cs="David"/>
+          <w:b/>
+          <w:sz w:val="26"/>
+          <w:szCs w:val="26"/>
+          <w:rtl w:val="true"/>
+        </w:rPr>
+        <w:t>עמדות מורים כלפי הכלה והקשר שלהן לשחיקה מקצועית, בתיווך תחושת המסוגלות העצמית</w:t>
+      </w:r>
+    </w:p>
+    <w:p>
+      <w:pPr>
+        <w:bidi w:val="true"/>
+        <w:spacing w:lineRule="auto" w:line="360" w:after="60" w:before="0"/>
+        <w:jc w:val="center"/>
+      </w:pPr>
+      <w:r>
+        <w:rPr>
+          <w:rFonts w:ascii="David" w:hAnsi="David" w:cs="David"/>
+          <w:b w:val="0"/>
+          <w:sz w:val="24"/>
+          <w:szCs w:val="24"/>
+          <w:rtl w:val="true"/>
+        </w:rPr>
+        <w:t>עבודה מסכמת בקורס "מחקר מתקדם בחינוך (שיטות מחקר כמותיות)"</w:t>
+      </w:r>
+    </w:p>
+    <w:p>
+      <w:pPr>
+        <w:bidi w:val="true"/>
+        <w:spacing w:lineRule="auto" w:line="360" w:after="600" w:before="0"/>
+        <w:jc w:val="center"/>
+      </w:pPr>
+      <w:r>
+        <w:rPr>
+          <w:rFonts w:ascii="David" w:hAnsi="David" w:cs="David"/>
+          <w:b w:val="0"/>
+          <w:sz w:val="24"/>
+          <w:szCs w:val="24"/>
+          <w:rtl w:val="true"/>
+        </w:rPr>
+        <w:t>סמסטר ב' תשפ"ו</w:t>
+      </w:r>
+    </w:p>
+    <w:p>
+      <w:pPr>
+        <w:bidi w:val="true"/>
+        <w:spacing w:lineRule="auto" w:line="360" w:after="80" w:before="0"/>
+        <w:jc w:val="center"/>
+      </w:pPr>
+      <w:r>
+        <w:rPr>
+          <w:rFonts w:ascii="David" w:hAnsi="David" w:cs="David"/>
+          <w:b/>
+          <w:sz w:val="28"/>
+          <w:szCs w:val="28"/>
+          <w:rtl w:val="true"/>
+        </w:rPr>
+        <w:t>מגישה: יסמין טהא, ת.ז. 60407764</w:t>
+      </w:r>
+    </w:p>
+    <w:p>
+      <w:pPr>
+        <w:bidi w:val="true"/>
+        <w:spacing w:lineRule="auto" w:line="360" w:after="80" w:before="0"/>
+        <w:jc w:val="center"/>
+      </w:pPr>
+      <w:r>
+        <w:rPr>
+          <w:rFonts w:ascii="David" w:hAnsi="David" w:cs="David"/>
+          <w:b w:val="0"/>
+          <w:sz w:val="24"/>
+          <w:szCs w:val="24"/>
+          <w:rtl w:val="true"/>
+        </w:rPr>
+        <w:t>מרצה: ד"ר אילן דניאלס רחימי</w:t>
+      </w:r>
+    </w:p>
+    <w:p>
+      <w:pPr>
+        <w:bidi w:val="true"/>
+        <w:spacing w:lineRule="auto" w:line="360" w:after="0" w:before="0"/>
+        <w:jc w:val="both"/>
+      </w:pPr>
+      <w:r>
+        <w:br w:type="page"/>
+      </w:r>
+    </w:p>
     <w:p>
       <w:pPr>
         <w:bidi w:val="true"/>
@@ -22,7 +242,7 @@
     <w:p>
       <w:pPr>
         <w:bidi w:val="true"/>
-        <w:spacing w:lineRule="auto" w:line="360" w:after="20" w:before="0"/>
+        <w:spacing w:lineRule="auto" w:line="360" w:after="160" w:before="0"/>
         <w:jc w:val="center"/>
       </w:pPr>
       <w:r>
@@ -34,23 +254,6 @@
           <w:rtl w:val="true"/>
         </w:rPr>
         <w:t>עמדות מורים כלפי הכלה והקשר שלהן לשחיקה מקצועית, בתיווך תחושת המסוגלות העצמית</w:t>
-      </w:r>
-    </w:p>
-    <w:p>
-      <w:pPr>
-        <w:bidi w:val="true"/>
-        <w:spacing w:lineRule="auto" w:line="360" w:after="160" w:before="0"/>
-        <w:jc w:val="center"/>
-      </w:pPr>
-      <w:r>
-        <w:rPr>
-          <w:rFonts w:ascii="David" w:hAnsi="David" w:cs="David"/>
-          <w:b w:val="0"/>
-          <w:sz w:val="22"/>
-          <w:szCs w:val="22"/>
-          <w:rtl w:val="true"/>
-        </w:rPr>
-        <w:t>עבודה מסכמת בקורס "מחקר מתקדם בחינוך (שיטות מחקר כמותיות)"  |  סמסטר ב' תשפ"ו</w:t>
       </w:r>
     </w:p>
     <w:p>

</xml_diff>